<commit_message>
feat: v13 — per-activity folders with Excel/CSV mock data, rename labs to activities
- New activities/ tree: one folder per activity (activity01 … activity12), each with
  its guide (README.md), workflow diagram and mock data files
- Mock data for every activity in Excel (live formulas, recalculated, zero errors)
  and CSV: financial statements, budget plans, FY actuals, the 99 Agency master-budget
  template, budget-vs-actual, Xero-style invoices/bills/trial balance and tax worksheets
- Learner Guide now carries full step-by-step walkthroughs for analyzing both the
  Excel workbook and the CSV data of every activity
- Terminology changed from 'lab' to 'activity' across the deck, LP, LG and guides
- Deck v13, LP/LG v13 with Document Version Control Record rows

Co-Authored-By: Claude Fable 5 <noreply@anthropic.com>
</commit_message>
<xml_diff>
--- a/courseware/LG-WSQ Budgeting for Small and Medium Enterprises.docx
+++ b/courseware/LG-WSQ Budgeting for Small and Medium Enterprises.docx
@@ -179,7 +179,7 @@
           <w:color w:val="1F6FEB"/>
           <w:sz w:val="24"/>
         </w:rPr>
-        <w:t>Version 12</w:t>
+        <w:t>Version 13</w:t>
       </w:r>
     </w:p>
     <w:p>
@@ -308,7 +308,7 @@
               <w:rPr>
                 <w:sz w:val="19"/>
               </w:rPr>
-              <w:t>10 August 2026</w:t>
+              <w:t>11 August 2026</w:t>
             </w:r>
           </w:p>
         </w:tc>
@@ -366,7 +366,7 @@
               <w:rPr>
                 <w:sz w:val="19"/>
               </w:rPr>
-              <w:t>10 August 2026</w:t>
+              <w:t>11 August 2026</w:t>
             </w:r>
           </w:p>
         </w:tc>
@@ -424,7 +424,7 @@
               <w:rPr>
                 <w:sz w:val="19"/>
               </w:rPr>
-              <w:t>10 August 2026</w:t>
+              <w:t>11 August 2026</w:t>
             </w:r>
           </w:p>
         </w:tc>
@@ -457,6 +457,64 @@
           </w:p>
         </w:tc>
       </w:tr>
+      <w:tr>
+        <w:tc>
+          <w:tcPr>
+            <w:tcW w:type="dxa" w:w="2160"/>
+          </w:tcPr>
+          <w:p>
+            <w:r/>
+            <w:r>
+              <w:rPr>
+                <w:sz w:val="19"/>
+              </w:rPr>
+              <w:t>13</w:t>
+            </w:r>
+          </w:p>
+        </w:tc>
+        <w:tc>
+          <w:tcPr>
+            <w:tcW w:type="dxa" w:w="2160"/>
+          </w:tcPr>
+          <w:p>
+            <w:r/>
+            <w:r>
+              <w:rPr>
+                <w:sz w:val="19"/>
+              </w:rPr>
+              <w:t>11 August 2026</w:t>
+            </w:r>
+          </w:p>
+        </w:tc>
+        <w:tc>
+          <w:tcPr>
+            <w:tcW w:type="dxa" w:w="2160"/>
+          </w:tcPr>
+          <w:p>
+            <w:r/>
+            <w:r>
+              <w:rPr>
+                <w:sz w:val="19"/>
+              </w:rPr>
+              <w:t>Added mock data sets for every activity (Excel workbooks + CSV mirrors, one folder per activity: activities/activity01 - activity12) with full step-by-step walkthroughs for analyzing both the Excel and the CSV data.</w:t>
+            </w:r>
+          </w:p>
+        </w:tc>
+        <w:tc>
+          <w:tcPr>
+            <w:tcW w:type="dxa" w:w="2160"/>
+          </w:tcPr>
+          <w:p>
+            <w:r/>
+            <w:r>
+              <w:rPr>
+                <w:sz w:val="19"/>
+              </w:rPr>
+              <w:t>Dr Alfred Ang</w:t>
+            </w:r>
+          </w:p>
+        </w:tc>
+      </w:tr>
     </w:tbl>
     <w:p>
       <w:r>
@@ -492,7 +550,7 @@
         </w:rPr>
         <w:t>Introduction</w:t>
         <w:tab/>
-        <w:t>4</w:t>
+        <w:t>3</w:t>
       </w:r>
     </w:p>
     <w:p>
@@ -511,7 +569,7 @@
         </w:rPr>
         <w:t>Course Learning Outcomes</w:t>
         <w:tab/>
-        <w:t>4</w:t>
+        <w:t>3</w:t>
       </w:r>
     </w:p>
     <w:p>
@@ -530,7 +588,7 @@
         </w:rPr>
         <w:t>Skills Framework Alignment</w:t>
         <w:tab/>
-        <w:t>4</w:t>
+        <w:t>3</w:t>
       </w:r>
     </w:p>
     <w:p>
@@ -549,7 +607,7 @@
         </w:rPr>
         <w:t>Before You Start — Environment Setup</w:t>
         <w:tab/>
-        <w:t>5</w:t>
+        <w:t>3</w:t>
       </w:r>
     </w:p>
     <w:p>
@@ -568,7 +626,7 @@
         </w:rPr>
         <w:t>Topic 01 — Introduction to Financial Budgeting</w:t>
         <w:tab/>
-        <w:t>5</w:t>
+        <w:t>3</w:t>
       </w:r>
     </w:p>
     <w:p>
@@ -586,9 +644,9 @@
           <w:color w:val="333333"/>
           <w:sz w:val="21"/>
         </w:rPr>
-        <w:t>Lab 1 — Financial Statements with Xero</w:t>
+        <w:t>Activity 1 — Financial Statements with Xero</w:t>
         <w:tab/>
-        <w:t>6</w:t>
+        <w:t>1</w:t>
       </w:r>
     </w:p>
     <w:p>
@@ -606,9 +664,9 @@
           <w:color w:val="333333"/>
           <w:sz w:val="21"/>
         </w:rPr>
-        <w:t>Lab 2 — Creating a Budget in Xero</w:t>
+        <w:t>Activity 2 — Creating a Budget in Xero</w:t>
         <w:tab/>
-        <w:t>7</w:t>
+        <w:t>1</w:t>
       </w:r>
     </w:p>
     <w:p>
@@ -626,9 +684,9 @@
           <w:color w:val="333333"/>
           <w:sz w:val="21"/>
         </w:rPr>
-        <w:t>Lab 3 — Identifying Budget Types</w:t>
+        <w:t>Activity 3 — Identifying Budget Types</w:t>
         <w:tab/>
-        <w:t>8</w:t>
+        <w:t>1</w:t>
       </w:r>
     </w:p>
     <w:p>
@@ -647,7 +705,7 @@
         </w:rPr>
         <w:t>Topic 02 — Financial Forecasting</w:t>
         <w:tab/>
-        <w:t>9</w:t>
+        <w:t>3</w:t>
       </w:r>
     </w:p>
     <w:p>
@@ -665,9 +723,9 @@
           <w:color w:val="333333"/>
           <w:sz w:val="21"/>
         </w:rPr>
-        <w:t>Lab 4 — Financial Forecasting with Xero</w:t>
+        <w:t>Activity 4 — Financial Forecasting with Xero</w:t>
         <w:tab/>
-        <w:t>9</w:t>
+        <w:t>1</w:t>
       </w:r>
     </w:p>
     <w:p>
@@ -686,7 +744,7 @@
         </w:rPr>
         <w:t>Topic 03 — Budget Preparation</w:t>
         <w:tab/>
-        <w:t>11</w:t>
+        <w:t>3</w:t>
       </w:r>
     </w:p>
     <w:p>
@@ -704,9 +762,9 @@
           <w:color w:val="333333"/>
           <w:sz w:val="21"/>
         </w:rPr>
-        <w:t>Lab 5 — Master Budget Preparation — 99 Agency Case Study</w:t>
+        <w:t>Activity 5 — Master Budget Preparation — 99 Agency Case Study</w:t>
         <w:tab/>
-        <w:t>11</w:t>
+        <w:t>1</w:t>
       </w:r>
     </w:p>
     <w:p>
@@ -725,7 +783,7 @@
         </w:rPr>
         <w:t>Topic 04 — Budget Control Plan</w:t>
         <w:tab/>
-        <w:t>13</w:t>
+        <w:t>3</w:t>
       </w:r>
     </w:p>
     <w:p>
@@ -743,9 +801,9 @@
           <w:color w:val="333333"/>
           <w:sz w:val="21"/>
         </w:rPr>
-        <w:t>Lab 6 — Knowledge Check Quiz — Budget Control</w:t>
+        <w:t>Activity 6 — Knowledge Check Quiz — Budget Control</w:t>
         <w:tab/>
-        <w:t>13</w:t>
+        <w:t>1</w:t>
       </w:r>
     </w:p>
     <w:p>
@@ -764,7 +822,7 @@
         </w:rPr>
         <w:t>Topic 05 — Budget Analysis</w:t>
         <w:tab/>
-        <w:t>14</w:t>
+        <w:t>3</w:t>
       </w:r>
     </w:p>
     <w:p>
@@ -782,9 +840,9 @@
           <w:color w:val="333333"/>
           <w:sz w:val="21"/>
         </w:rPr>
-        <w:t>Lab 7 — Budget Variance Analysis in Xero</w:t>
+        <w:t>Activity 7 — Budget Variance Analysis in Xero</w:t>
         <w:tab/>
-        <w:t>15</w:t>
+        <w:t>1</w:t>
       </w:r>
     </w:p>
     <w:p>
@@ -802,9 +860,9 @@
           <w:color w:val="333333"/>
           <w:sz w:val="21"/>
         </w:rPr>
-        <w:t>Lab 8 — Budget Analysis Dashboard with Power BI</w:t>
+        <w:t>Activity 8 — Budget Analysis Dashboard with Power BI</w:t>
         <w:tab/>
-        <w:t>16</w:t>
+        <w:t>1</w:t>
       </w:r>
     </w:p>
     <w:p>
@@ -823,7 +881,7 @@
         </w:rPr>
         <w:t>Topic 06 — Budget Approval</w:t>
         <w:tab/>
-        <w:t>17</w:t>
+        <w:t>3</w:t>
       </w:r>
     </w:p>
     <w:p>
@@ -841,9 +899,9 @@
           <w:color w:val="333333"/>
           <w:sz w:val="21"/>
         </w:rPr>
-        <w:t>Lab 9 — Knowledge Check Quiz — Budget Approval</w:t>
+        <w:t>Activity 9 — Knowledge Check Quiz — Budget Approval</w:t>
         <w:tab/>
-        <w:t>17</w:t>
+        <w:t>1</w:t>
       </w:r>
     </w:p>
     <w:p>
@@ -862,7 +920,7 @@
         </w:rPr>
         <w:t>Topic 07 — Financial Compliance</w:t>
         <w:tab/>
-        <w:t>18</w:t>
+        <w:t>3</w:t>
       </w:r>
     </w:p>
     <w:p>
@@ -880,9 +938,9 @@
           <w:color w:val="333333"/>
           <w:sz w:val="21"/>
         </w:rPr>
-        <w:t>Lab 10 — Determining the Year of Assessment</w:t>
+        <w:t>Activity 10 — Determining the Year of Assessment</w:t>
         <w:tab/>
-        <w:t>19</w:t>
+        <w:t>1</w:t>
       </w:r>
     </w:p>
     <w:p>
@@ -900,9 +958,9 @@
           <w:color w:val="333333"/>
           <w:sz w:val="21"/>
         </w:rPr>
-        <w:t>Lab 11 — ECI and Corporate Tax Filing Deadlines</w:t>
+        <w:t>Activity 11 — ECI and Corporate Tax Filing Deadlines</w:t>
         <w:tab/>
-        <w:t>20</w:t>
+        <w:t>1</w:t>
       </w:r>
     </w:p>
     <w:p>
@@ -920,9 +978,9 @@
           <w:color w:val="333333"/>
           <w:sz w:val="21"/>
         </w:rPr>
-        <w:t>Lab 12 — Start-Up Tax Computation</w:t>
+        <w:t>Activity 12 — Start-Up Tax Computation</w:t>
         <w:tab/>
-        <w:t>21</w:t>
+        <w:t>1</w:t>
       </w:r>
     </w:p>
     <w:p>
@@ -941,7 +999,7 @@
         </w:rPr>
         <w:t>Assessment Preparation</w:t>
         <w:tab/>
-        <w:t>22</w:t>
+        <w:t>3</w:t>
       </w:r>
     </w:p>
     <w:p>
@@ -960,7 +1018,7 @@
         </w:rPr>
         <w:t>Glossary</w:t>
         <w:tab/>
-        <w:t>22</w:t>
+        <w:t>3</w:t>
       </w:r>
     </w:p>
     <w:p>
@@ -983,7 +1041,7 @@
     </w:p>
     <w:p>
       <w:r>
-        <w:t>Use this guide alongside the course slides and the activity files in the labs/ folder of the course repository. The slides give each activity a one-page overview; this guide carries the full detailed steps. The final assessment is open book — you may refer to the slides, this Learner Guide and any approved materials.</w:t>
+        <w:t>Use this guide alongside the course slides and the activity folders (activities/) of the course repository. The slides give each activity a one-page overview; this guide carries the full detailed steps. The final assessment is open book — you may refer to the slides, this Learner Guide and any approved materials.</w:t>
       </w:r>
     </w:p>
     <w:p>
@@ -1258,7 +1316,7 @@
         <w:pStyle w:val="ListBullet"/>
       </w:pPr>
       <w:r>
-        <w:t>The 99 Agency working template and the tax computation template — downloaded from the LMS (lms-tms.tertiaryinfotech.com) or Google Classroom as directed by the trainer.</w:t>
+        <w:t>The lab data files (Excel workbooks + CSV mirrors) — one folder per activity, activities/activity01 … activity12, in the course repository and on the LMS (lms-tms.tertiaryinfotech.com) under Activities. Every activity's mock data (financial statements, budgets, actuals, the 99 Agency template, Xero-style exports and tax worksheets) ships there.</w:t>
       </w:r>
     </w:p>
     <w:p>
@@ -1413,7 +1471,7 @@
         <w:pStyle w:val="Heading2"/>
       </w:pPr>
       <w:r>
-        <w:t>Lab 1 — Financial Statements with Xero</w:t>
+        <w:t>Activity 1 — Financial Statements with Xero</w:t>
       </w:r>
     </w:p>
     <w:p>
@@ -1454,7 +1512,7 @@
               <a:graphicData uri="http://schemas.openxmlformats.org/drawingml/2006/picture">
                 <pic:pic>
                   <pic:nvPicPr>
-                    <pic:cNvPr id="0" name="lab-01-workflow.png"/>
+                    <pic:cNvPr id="0" name="activity-01-workflow.png"/>
                     <pic:cNvPicPr/>
                   </pic:nvPicPr>
                   <pic:blipFill>
@@ -1484,7 +1542,7 @@
           <w:color w:val="555B66"/>
           <w:sz w:val="18"/>
         </w:rPr>
-        <w:t>Lab 1 workflow — Financial Statements with Xero</w:t>
+        <w:t>Activity 1 workflow — Financial Statements with Xero</w:t>
       </w:r>
     </w:p>
     <w:p>
@@ -1624,6 +1682,248 @@
           <w:color w:val="1F6FEB"/>
           <w:sz w:val="22"/>
         </w:rPr>
+        <w:t>Data files for this activity (activities/activity01/)</w:t>
+      </w:r>
+    </w:p>
+    <w:p>
+      <w:pPr>
+        <w:pStyle w:val="ListBullet"/>
+      </w:pPr>
+      <w:r>
+        <w:t>activity-01-financial-statements.xlsx — GreenLeaf Trading Pte Ltd — Income Statement, Balance Sheet and Cash Flow sheets with live formulas.</w:t>
+      </w:r>
+    </w:p>
+    <w:p>
+      <w:pPr>
+        <w:pStyle w:val="ListBullet"/>
+      </w:pPr>
+      <w:r>
+        <w:t>activity-01-income-statement.csv — The Income Statement as plain data (Line Item, Amount).</w:t>
+      </w:r>
+    </w:p>
+    <w:p>
+      <w:pPr>
+        <w:pStyle w:val="ListBullet"/>
+      </w:pPr>
+      <w:r>
+        <w:t>activity-01-balance-sheet.csv — The Balance Sheet as plain data.</w:t>
+      </w:r>
+    </w:p>
+    <w:p>
+      <w:pPr>
+        <w:pStyle w:val="ListBullet"/>
+      </w:pPr>
+      <w:r>
+        <w:t>activity-01-cash-flow.csv — The Cash Flow Statement as plain data.</w:t>
+      </w:r>
+    </w:p>
+    <w:p>
+      <w:r>
+        <w:rPr>
+          <w:b/>
+          <w:color w:val="1F6FEB"/>
+          <w:sz w:val="22"/>
+        </w:rPr>
+        <w:t>Analyzing the Excel workbook — step by step</w:t>
+      </w:r>
+    </w:p>
+    <w:p>
+      <w:pPr>
+        <w:ind w:left="360" w:hanging="360"/>
+      </w:pPr>
+      <w:r>
+        <w:rPr>
+          <w:b/>
+          <w:color w:val="1F6FEB"/>
+        </w:rPr>
+        <w:t xml:space="preserve">1. </w:t>
+      </w:r>
+      <w:r>
+        <w:t>Open activities/activity01/activity-01-financial-statements.xlsx in Excel (or Google Sheets / LibreOffice). It has three sheets — Income Statement, Balance Sheet and Cash Flow — mirroring the three statements you generated in Xero.</w:t>
+      </w:r>
+    </w:p>
+    <w:p>
+      <w:pPr>
+        <w:ind w:left="360" w:hanging="360"/>
+      </w:pPr>
+      <w:r>
+        <w:rPr>
+          <w:b/>
+          <w:color w:val="1F6FEB"/>
+        </w:rPr>
+        <w:t xml:space="preserve">2. </w:t>
+      </w:r>
+      <w:r>
+        <w:t>On the Income Statement sheet, click cell B6 (Total Revenue) and read the formula bar: =SUM(B4:B5). Blue numbers are inputs; black numbers are formulas — never overtype a black cell.</w:t>
+      </w:r>
+    </w:p>
+    <w:p>
+      <w:pPr>
+        <w:ind w:left="360" w:hanging="360"/>
+      </w:pPr>
+      <w:r>
+        <w:rPr>
+          <w:b/>
+          <w:color w:val="1F6FEB"/>
+        </w:rPr>
+        <w:t xml:space="preserve">3. </w:t>
+      </w:r>
+      <w:r>
+        <w:t>Trace the P&amp;L structure downwards: Total Revenue − Total COGS = Gross Profit (B10); Gross Profit − Total SG&amp;A = Operating Profit; then Interest, Tax (17%) and Net Profit. Click each bold cell and confirm its formula matches the story.</w:t>
+      </w:r>
+    </w:p>
+    <w:p>
+      <w:pPr>
+        <w:ind w:left="360" w:hanging="360"/>
+      </w:pPr>
+      <w:r>
+        <w:rPr>
+          <w:b/>
+          <w:color w:val="1F6FEB"/>
+        </w:rPr>
+        <w:t xml:space="preserve">4. </w:t>
+      </w:r>
+      <w:r>
+        <w:t>Read the two ratio cells at the bottom: Gross Profit Margin = Gross Profit ÷ Total Revenue (62.1%) and Net Profit Margin (21.4%). Change Marketing to 88,000 and watch Operating Profit, Tax, Net Profit and both margins recalculate; press Ctrl+Z to undo.</w:t>
+      </w:r>
+    </w:p>
+    <w:p>
+      <w:pPr>
+        <w:ind w:left="360" w:hanging="360"/>
+      </w:pPr>
+      <w:r>
+        <w:rPr>
+          <w:b/>
+          <w:color w:val="1F6FEB"/>
+        </w:rPr>
+        <w:t xml:space="preserve">5. </w:t>
+      </w:r>
+      <w:r>
+        <w:t>On the Balance Sheet sheet, verify TOTAL ASSETS (770,000) = Total Current Assets + Net PP&amp;E, and that the Balance Check cell at the bottom shows 0 — Assets − Liabilities − Equity must always be zero. If you ever edit an input and the check is non-zero, the statement no longer balances.</w:t>
+      </w:r>
+    </w:p>
+    <w:p>
+      <w:pPr>
+        <w:ind w:left="360" w:hanging="360"/>
+      </w:pPr>
+      <w:r>
+        <w:rPr>
+          <w:b/>
+          <w:color w:val="1F6FEB"/>
+        </w:rPr>
+        <w:t xml:space="preserve">6. </w:t>
+      </w:r>
+      <w:r>
+        <w:t>On the Cash Flow sheet, follow the three sections: Operating (Net Profit + Depreciation ± working-capital movements = 254,470), Investing (−80,000 CAPEX) and Financing (−70,000). Confirm Closing Cash (185,000) equals the Cash and Bank line on the Balance Sheet — the statements tie.</w:t>
+      </w:r>
+    </w:p>
+    <w:p>
+      <w:pPr>
+        <w:ind w:left="360" w:hanging="360"/>
+      </w:pPr>
+      <w:r>
+        <w:rPr>
+          <w:b/>
+          <w:color w:val="1F6FEB"/>
+        </w:rPr>
+        <w:t xml:space="preserve">7. </w:t>
+      </w:r>
+      <w:r>
+        <w:t>Compare each sheet with the same statement you generated from the Xero demo company: identify where Revenue, COGS, Assets, Liabilities, Equity and the operating/investing/financing sections appear in both.</w:t>
+      </w:r>
+    </w:p>
+    <w:p>
+      <w:r>
+        <w:rPr>
+          <w:b/>
+          <w:color w:val="1F6FEB"/>
+          <w:sz w:val="22"/>
+        </w:rPr>
+        <w:t>Analyzing the CSV data — step by step</w:t>
+      </w:r>
+    </w:p>
+    <w:p>
+      <w:pPr>
+        <w:ind w:left="360" w:hanging="360"/>
+      </w:pPr>
+      <w:r>
+        <w:rPr>
+          <w:b/>
+          <w:color w:val="1F6FEB"/>
+        </w:rPr>
+        <w:t xml:space="preserve">1. </w:t>
+      </w:r>
+      <w:r>
+        <w:t>Open activities/activity01/activity-01-income-statement.csv in a text editor first — see that a CSV is just comma-separated rows with a header line (Line Item, Amount). This is the format accounting systems export.</w:t>
+      </w:r>
+    </w:p>
+    <w:p>
+      <w:pPr>
+        <w:ind w:left="360" w:hanging="360"/>
+      </w:pPr>
+      <w:r>
+        <w:rPr>
+          <w:b/>
+          <w:color w:val="1F6FEB"/>
+        </w:rPr>
+        <w:t xml:space="preserve">2. </w:t>
+      </w:r>
+      <w:r>
+        <w:t>Import it into a blank spreadsheet (Excel: Data → Get Data → From Text/CSV; Google Sheets: File → Import → Upload). Confirm the Amount column imported as numbers, not text.</w:t>
+      </w:r>
+    </w:p>
+    <w:p>
+      <w:pPr>
+        <w:ind w:left="360" w:hanging="360"/>
+      </w:pPr>
+      <w:r>
+        <w:rPr>
+          <w:b/>
+          <w:color w:val="1F6FEB"/>
+        </w:rPr>
+        <w:t xml:space="preserve">3. </w:t>
+      </w:r>
+      <w:r>
+        <w:t>The CSV carries values only — no formulas. Rebuild the checks yourself: in a spare cell compute Gross Profit = Total Revenue − Total COGS with a SUM/lookup, and confirm you get 745,000, matching the Excel workbook.</w:t>
+      </w:r>
+    </w:p>
+    <w:p>
+      <w:pPr>
+        <w:ind w:left="360" w:hanging="360"/>
+      </w:pPr>
+      <w:r>
+        <w:rPr>
+          <w:b/>
+          <w:color w:val="1F6FEB"/>
+        </w:rPr>
+        <w:t xml:space="preserve">4. </w:t>
+      </w:r>
+      <w:r>
+        <w:t>Import activity-01-balance-sheet.csv the same way and verify TOTAL ASSETS (770,000) = TOTAL LIABILITIES (348,000) + TOTAL EQUITY (422,000) with a formula.</w:t>
+      </w:r>
+    </w:p>
+    <w:p>
+      <w:pPr>
+        <w:ind w:left="360" w:hanging="360"/>
+      </w:pPr>
+      <w:r>
+        <w:rPr>
+          <w:b/>
+          <w:color w:val="1F6FEB"/>
+        </w:rPr>
+        <w:t xml:space="preserve">5. </w:t>
+      </w:r>
+      <w:r>
+        <w:t>Import activity-01-cash-flow.csv and verify Opening Cash + Net Change in Cash = Closing Cash (80,530 + 104,470 = 185,000).</w:t>
+      </w:r>
+    </w:p>
+    <w:p>
+      <w:r>
+        <w:rPr>
+          <w:b/>
+          <w:color w:val="1F6FEB"/>
+          <w:sz w:val="22"/>
+        </w:rPr>
         <w:t>Check your work</w:t>
       </w:r>
     </w:p>
@@ -1644,7 +1944,7 @@
         <w:rPr>
           <w:sz w:val="20"/>
         </w:rPr>
-        <w:t>A printable copy of this activity is in labs/lab-01-*.md in the course repository.</w:t>
+        <w:t>A printable copy of this activity — with its workflow diagram and data files — is in the activities/activity01/ folder of the course repository.</w:t>
       </w:r>
     </w:p>
     <w:p/>
@@ -1653,7 +1953,7 @@
         <w:pStyle w:val="Heading2"/>
       </w:pPr>
       <w:r>
-        <w:t>Lab 2 — Creating a Budget in Xero</w:t>
+        <w:t>Activity 2 — Creating a Budget in Xero</w:t>
       </w:r>
     </w:p>
     <w:p>
@@ -1694,7 +1994,7 @@
               <a:graphicData uri="http://schemas.openxmlformats.org/drawingml/2006/picture">
                 <pic:pic>
                   <pic:nvPicPr>
-                    <pic:cNvPr id="0" name="lab-02-workflow.png"/>
+                    <pic:cNvPr id="0" name="activity-02-workflow.png"/>
                     <pic:cNvPicPr/>
                   </pic:nvPicPr>
                   <pic:blipFill>
@@ -1724,7 +2024,7 @@
           <w:color w:val="555B66"/>
           <w:sz w:val="18"/>
         </w:rPr>
-        <w:t>Lab 2 workflow — Creating a Budget in Xero</w:t>
+        <w:t>Activity 2 workflow — Creating a Budget in Xero</w:t>
       </w:r>
     </w:p>
     <w:p>
@@ -1864,6 +2164,217 @@
           <w:color w:val="1F6FEB"/>
           <w:sz w:val="22"/>
         </w:rPr>
+        <w:t>Data files for this activity (activities/activity02/)</w:t>
+      </w:r>
+    </w:p>
+    <w:p>
+      <w:pPr>
+        <w:pStyle w:val="ListBullet"/>
+      </w:pPr>
+      <w:r>
+        <w:t>activity-02-budget-plan.xlsx — FY2026 12-month budget plan — Sales grows 2%/month; commission, discount and direct costs are live %-of-sales formulas.</w:t>
+      </w:r>
+    </w:p>
+    <w:p>
+      <w:pPr>
+        <w:pStyle w:val="ListBullet"/>
+      </w:pPr>
+      <w:r>
+        <w:t>activity-02-budget-plan.csv — The same budget as plain data, one row per account, Jan–Dec + Total.</w:t>
+      </w:r>
+    </w:p>
+    <w:p>
+      <w:r>
+        <w:rPr>
+          <w:b/>
+          <w:color w:val="1F6FEB"/>
+          <w:sz w:val="22"/>
+        </w:rPr>
+        <w:t>Analyzing the Excel workbook — step by step</w:t>
+      </w:r>
+    </w:p>
+    <w:p>
+      <w:pPr>
+        <w:ind w:left="360" w:hanging="360"/>
+      </w:pPr>
+      <w:r>
+        <w:rPr>
+          <w:b/>
+          <w:color w:val="1F6FEB"/>
+        </w:rPr>
+        <w:t xml:space="preserve">1. </w:t>
+      </w:r>
+      <w:r>
+        <w:t>Open activities/activity02/activity-02-budget-plan.xlsx. Row 2 holds the three driver rates in blue — Commission 5%, Discount 2%, Direct Costs 55%. Rows 5–14 are the account lines across Jan–Dec with a Total column.</w:t>
+      </w:r>
+    </w:p>
+    <w:p>
+      <w:pPr>
+        <w:ind w:left="360" w:hanging="360"/>
+      </w:pPr>
+      <w:r>
+        <w:rPr>
+          <w:b/>
+          <w:color w:val="1F6FEB"/>
+        </w:rPr>
+        <w:t xml:space="preserve">2. </w:t>
+      </w:r>
+      <w:r>
+        <w:t>Click any Sales Commission cell (row 6) and read its formula, e.g. =B5*$C$2 — commission is derived from Sales via an absolute reference to the rate cell. This is why you budget drivers, not hardcoded numbers.</w:t>
+      </w:r>
+    </w:p>
+    <w:p>
+      <w:pPr>
+        <w:ind w:left="360" w:hanging="360"/>
+      </w:pPr>
+      <w:r>
+        <w:rPr>
+          <w:b/>
+          <w:color w:val="1F6FEB"/>
+        </w:rPr>
+        <w:t xml:space="preserve">3. </w:t>
+      </w:r>
+      <w:r>
+        <w:t>Click the Total column (column N): every account totals with =SUM(B..M). Confirm Sales totals 1,207,085 for the year.</w:t>
+      </w:r>
+    </w:p>
+    <w:p>
+      <w:pPr>
+        <w:ind w:left="360" w:hanging="360"/>
+      </w:pPr>
+      <w:r>
+        <w:rPr>
+          <w:b/>
+          <w:color w:val="1F6FEB"/>
+        </w:rPr>
+        <w:t xml:space="preserve">4. </w:t>
+      </w:r>
+      <w:r>
+        <w:t>Read the Net Surplus row: each month = Sales − all expense rows. Check which months are surplus and which are deficit.</w:t>
+      </w:r>
+    </w:p>
+    <w:p>
+      <w:pPr>
+        <w:ind w:left="360" w:hanging="360"/>
+      </w:pPr>
+      <w:r>
+        <w:rPr>
+          <w:b/>
+          <w:color w:val="1F6FEB"/>
+        </w:rPr>
+        <w:t xml:space="preserve">5. </w:t>
+      </w:r>
+      <w:r>
+        <w:t>Test the model: change the Direct Costs rate (G2) from 55% to 60% and watch every month's Direct Costs and Net Surplus recalculate. Undo (Ctrl+Z).</w:t>
+      </w:r>
+    </w:p>
+    <w:p>
+      <w:pPr>
+        <w:ind w:left="360" w:hanging="360"/>
+      </w:pPr>
+      <w:r>
+        <w:rPr>
+          <w:b/>
+          <w:color w:val="1F6FEB"/>
+        </w:rPr>
+        <w:t xml:space="preserve">6. </w:t>
+      </w:r>
+      <w:r>
+        <w:t>Now enter this budget into Xero Budget Manager (Accounting → Reports → Budget Manager): create a 12-month budget and key the monthly figures for each account — use the green-arrow fill with a 2% monthly increase for Sales instead of typing all 12 cells.</w:t>
+      </w:r>
+    </w:p>
+    <w:p>
+      <w:pPr>
+        <w:ind w:left="360" w:hanging="360"/>
+      </w:pPr>
+      <w:r>
+        <w:rPr>
+          <w:b/>
+          <w:color w:val="1F6FEB"/>
+        </w:rPr>
+        <w:t xml:space="preserve">7. </w:t>
+      </w:r>
+      <w:r>
+        <w:t>Save in Xero, then cross-check: the Xero budget's annual total for Sales must equal the workbook's Total cell.</w:t>
+      </w:r>
+    </w:p>
+    <w:p>
+      <w:r>
+        <w:rPr>
+          <w:b/>
+          <w:color w:val="1F6FEB"/>
+          <w:sz w:val="22"/>
+        </w:rPr>
+        <w:t>Analyzing the CSV data — step by step</w:t>
+      </w:r>
+    </w:p>
+    <w:p>
+      <w:pPr>
+        <w:ind w:left="360" w:hanging="360"/>
+      </w:pPr>
+      <w:r>
+        <w:rPr>
+          <w:b/>
+          <w:color w:val="1F6FEB"/>
+        </w:rPr>
+        <w:t xml:space="preserve">1. </w:t>
+      </w:r>
+      <w:r>
+        <w:t>Open activities/activity02/activity-02-budget-plan.csv in a text editor — one row per account, columns Jan–Dec plus Total, values only.</w:t>
+      </w:r>
+    </w:p>
+    <w:p>
+      <w:pPr>
+        <w:ind w:left="360" w:hanging="360"/>
+      </w:pPr>
+      <w:r>
+        <w:rPr>
+          <w:b/>
+          <w:color w:val="1F6FEB"/>
+        </w:rPr>
+        <w:t xml:space="preserve">2. </w:t>
+      </w:r>
+      <w:r>
+        <w:t>Import it into a blank spreadsheet. Add a check column: =SUM(B2:M2) beside the imported Total and confirm they agree for every account — this is how you validate someone else's exported budget.</w:t>
+      </w:r>
+    </w:p>
+    <w:p>
+      <w:pPr>
+        <w:ind w:left="360" w:hanging="360"/>
+      </w:pPr>
+      <w:r>
+        <w:rPr>
+          <w:b/>
+          <w:color w:val="1F6FEB"/>
+        </w:rPr>
+        <w:t xml:space="preserve">3. </w:t>
+      </w:r>
+      <w:r>
+        <w:t>Compute the commission rate implied by the data: Sales Commission Total ÷ Sales Total ≈ 5%. Because a CSV has no formulas, recomputing the driver rates is how you reverse-engineer the assumptions.</w:t>
+      </w:r>
+    </w:p>
+    <w:p>
+      <w:pPr>
+        <w:ind w:left="360" w:hanging="360"/>
+      </w:pPr>
+      <w:r>
+        <w:rPr>
+          <w:b/>
+          <w:color w:val="1F6FEB"/>
+        </w:rPr>
+        <w:t xml:space="preserve">4. </w:t>
+      </w:r>
+      <w:r>
+        <w:t>Use this CSV as your data-entry source when keying the budget into Xero Budget Manager if you prefer working from a printed sheet.</w:t>
+      </w:r>
+    </w:p>
+    <w:p>
+      <w:r>
+        <w:rPr>
+          <w:b/>
+          <w:color w:val="1F6FEB"/>
+          <w:sz w:val="22"/>
+        </w:rPr>
         <w:t>Check your work</w:t>
       </w:r>
     </w:p>
@@ -1884,7 +2395,7 @@
         <w:rPr>
           <w:sz w:val="20"/>
         </w:rPr>
-        <w:t>A printable copy of this activity is in labs/lab-02-*.md in the course repository.</w:t>
+        <w:t>A printable copy of this activity — with its workflow diagram and data files — is in the activities/activity02/ folder of the course repository.</w:t>
       </w:r>
     </w:p>
     <w:p/>
@@ -1893,7 +2404,7 @@
         <w:pStyle w:val="Heading2"/>
       </w:pPr>
       <w:r>
-        <w:t>Lab 3 — Identifying Budget Types</w:t>
+        <w:t>Activity 3 — Identifying Budget Types</w:t>
       </w:r>
     </w:p>
     <w:p>
@@ -1934,7 +2445,7 @@
               <a:graphicData uri="http://schemas.openxmlformats.org/drawingml/2006/picture">
                 <pic:pic>
                   <pic:nvPicPr>
-                    <pic:cNvPr id="0" name="lab-03-workflow.png"/>
+                    <pic:cNvPr id="0" name="activity-03-workflow.png"/>
                     <pic:cNvPicPr/>
                   </pic:nvPicPr>
                   <pic:blipFill>
@@ -1964,7 +2475,7 @@
           <w:color w:val="555B66"/>
           <w:sz w:val="18"/>
         </w:rPr>
-        <w:t>Lab 3 workflow — Identifying Budget Types</w:t>
+        <w:t>Activity 3 workflow — Identifying Budget Types</w:t>
       </w:r>
     </w:p>
     <w:p>
@@ -1989,7 +2500,7 @@
         <w:t xml:space="preserve">1. </w:t>
       </w:r>
       <w:r>
-        <w:t>List the accounts you budgeted in Lab 2 (revenue lines, cost of sales, SG&amp;A expenses, capital items).</w:t>
+        <w:t>List the accounts you budgeted in Activity 2 (revenue lines, cost of sales, SG&amp;A expenses, capital items).</w:t>
       </w:r>
     </w:p>
     <w:p>
@@ -2044,41 +2555,23 @@
           <w:color w:val="1F6FEB"/>
           <w:sz w:val="22"/>
         </w:rPr>
-        <w:t>Check your work</w:t>
-      </w:r>
-    </w:p>
-    <w:p>
-      <w:r>
-        <w:t>You can name the budget type and preparation method for every parameter in your Xero budget and justify the classification.</w:t>
-      </w:r>
-    </w:p>
-    <w:p>
-      <w:r>
-        <w:rPr>
-          <w:b/>
-          <w:color w:val="1F6FEB"/>
-        </w:rPr>
-        <w:t xml:space="preserve">Note: </w:t>
-      </w:r>
-      <w:r>
-        <w:rPr>
-          <w:sz w:val="20"/>
-        </w:rPr>
-        <w:t>A printable copy of this activity is in labs/lab-03-*.md in the course repository.</w:t>
-      </w:r>
-    </w:p>
-    <w:p/>
-    <w:p>
-      <w:pPr>
-        <w:pStyle w:val="Heading1"/>
-      </w:pPr>
-      <w:r>
-        <w:t>Topic 02 — Financial Forecasting</w:t>
-      </w:r>
-    </w:p>
-    <w:p>
-      <w:r>
-        <w:t>Key principles of accounting · Key principles of corporate finance · Time value of money  (A2, K2)</w:t>
+        <w:t>Data files for this activity (activities/activity03/)</w:t>
+      </w:r>
+    </w:p>
+    <w:p>
+      <w:pPr>
+        <w:pStyle w:val="ListBullet"/>
+      </w:pPr>
+      <w:r>
+        <w:t>activity-03-budget-classification.xlsx — 12 spending items to classify — yellow Budget Type and Preparation Method columns to fill; a Reference sheet defines every term.</w:t>
+      </w:r>
+    </w:p>
+    <w:p>
+      <w:pPr>
+        <w:pStyle w:val="ListBullet"/>
+      </w:pPr>
+      <w:r>
+        <w:t>activity-03-budget-classification.csv — The same worksheet as plain data with empty classification columns.</w:t>
       </w:r>
     </w:p>
     <w:p>
@@ -2088,6 +2581,205 @@
           <w:color w:val="1F6FEB"/>
           <w:sz w:val="22"/>
         </w:rPr>
+        <w:t>Analyzing the Excel workbook — step by step</w:t>
+      </w:r>
+    </w:p>
+    <w:p>
+      <w:pPr>
+        <w:ind w:left="360" w:hanging="360"/>
+      </w:pPr>
+      <w:r>
+        <w:rPr>
+          <w:b/>
+          <w:color w:val="1F6FEB"/>
+        </w:rPr>
+        <w:t xml:space="preserve">1. </w:t>
+      </w:r>
+      <w:r>
+        <w:t>Open activities/activity03/activity-03-budget-classification.xlsx on the Worksheet sheet — 12 real spending items with their annual amounts. The yellow cells are yours to fill.</w:t>
+      </w:r>
+    </w:p>
+    <w:p>
+      <w:pPr>
+        <w:ind w:left="360" w:hanging="360"/>
+      </w:pPr>
+      <w:r>
+        <w:rPr>
+          <w:b/>
+          <w:color w:val="1F6FEB"/>
+        </w:rPr>
+        <w:t xml:space="preserve">2. </w:t>
+      </w:r>
+      <w:r>
+        <w:t>Open the Reference sheet and read the definitions: Operating / Cash / Capital / Financial budget types, and Baseline / Incremental / Zero-based / Hybrid preparation methods.</w:t>
+      </w:r>
+    </w:p>
+    <w:p>
+      <w:pPr>
+        <w:ind w:left="360" w:hanging="360"/>
+      </w:pPr>
+      <w:r>
+        <w:rPr>
+          <w:b/>
+          <w:color w:val="1F6FEB"/>
+        </w:rPr>
+        <w:t xml:space="preserve">3. </w:t>
+      </w:r>
+      <w:r>
+        <w:t>For each item, fill Budget Type: e.g. 'Monthly office rental' → Operating; 'New delivery van purchase' → Capital; 'Cash float for retail outlets' → Cash; 'Bank loan repayment' and 'Dividend payout' → Financial.</w:t>
+      </w:r>
+    </w:p>
+    <w:p>
+      <w:pPr>
+        <w:ind w:left="360" w:hanging="360"/>
+      </w:pPr>
+      <w:r>
+        <w:rPr>
+          <w:b/>
+          <w:color w:val="1F6FEB"/>
+        </w:rPr>
+        <w:t xml:space="preserve">4. </w:t>
+      </w:r>
+      <w:r>
+        <w:t>Fill Preparation Method for each: rent is a Baseline carry-forward; salaries are typically Incremental; a brand-new POS system is Zero-based; raw materials may be Hybrid (baseline volume × new prices). Be ready to justify each choice.</w:t>
+      </w:r>
+    </w:p>
+    <w:p>
+      <w:pPr>
+        <w:ind w:left="360" w:hanging="360"/>
+      </w:pPr>
+      <w:r>
+        <w:rPr>
+          <w:b/>
+          <w:color w:val="1F6FEB"/>
+        </w:rPr>
+        <w:t xml:space="preserve">5. </w:t>
+      </w:r>
+      <w:r>
+        <w:t>Add a summary: in a spare cell use =COUNTIF(C5:C16,"Operating") (and repeat for the other types) to count how many items fall in each budget type.</w:t>
+      </w:r>
+    </w:p>
+    <w:p>
+      <w:pPr>
+        <w:ind w:left="360" w:hanging="360"/>
+      </w:pPr>
+      <w:r>
+        <w:rPr>
+          <w:b/>
+          <w:color w:val="1F6FEB"/>
+        </w:rPr>
+        <w:t xml:space="preserve">6. </w:t>
+      </w:r>
+      <w:r>
+        <w:t>Compare your classification with a neighbour and defend any differences using the Reference definitions — several items have more than one defensible method.</w:t>
+      </w:r>
+    </w:p>
+    <w:p>
+      <w:r>
+        <w:rPr>
+          <w:b/>
+          <w:color w:val="1F6FEB"/>
+          <w:sz w:val="22"/>
+        </w:rPr>
+        <w:t>Analyzing the CSV data — step by step</w:t>
+      </w:r>
+    </w:p>
+    <w:p>
+      <w:pPr>
+        <w:ind w:left="360" w:hanging="360"/>
+      </w:pPr>
+      <w:r>
+        <w:rPr>
+          <w:b/>
+          <w:color w:val="1F6FEB"/>
+        </w:rPr>
+        <w:t xml:space="preserve">1. </w:t>
+      </w:r>
+      <w:r>
+        <w:t>Open activities/activity03/activity-03-budget-classification.csv in a text editor to see the raw worksheet — the two classification columns are empty strings.</w:t>
+      </w:r>
+    </w:p>
+    <w:p>
+      <w:pPr>
+        <w:ind w:left="360" w:hanging="360"/>
+      </w:pPr>
+      <w:r>
+        <w:rPr>
+          <w:b/>
+          <w:color w:val="1F6FEB"/>
+        </w:rPr>
+        <w:t xml:space="preserve">2. </w:t>
+      </w:r>
+      <w:r>
+        <w:t>Import into a spreadsheet, fill the two columns as above, then File → Save As / Download as CSV to practise round-tripping data: open your saved CSV again and confirm your classifications survived.</w:t>
+      </w:r>
+    </w:p>
+    <w:p>
+      <w:pPr>
+        <w:ind w:left="360" w:hanging="360"/>
+      </w:pPr>
+      <w:r>
+        <w:rPr>
+          <w:b/>
+          <w:color w:val="1F6FEB"/>
+        </w:rPr>
+        <w:t xml:space="preserve">3. </w:t>
+      </w:r>
+      <w:r>
+        <w:t>Sort the imported data by your Budget Type column to group items and check each group's total annual amount with SUMIF.</w:t>
+      </w:r>
+    </w:p>
+    <w:p>
+      <w:r>
+        <w:rPr>
+          <w:b/>
+          <w:color w:val="1F6FEB"/>
+          <w:sz w:val="22"/>
+        </w:rPr>
+        <w:t>Check your work</w:t>
+      </w:r>
+    </w:p>
+    <w:p>
+      <w:r>
+        <w:t>You can name the budget type and preparation method for every parameter in your Xero budget and justify the classification.</w:t>
+      </w:r>
+    </w:p>
+    <w:p>
+      <w:r>
+        <w:rPr>
+          <w:b/>
+          <w:color w:val="1F6FEB"/>
+        </w:rPr>
+        <w:t xml:space="preserve">Note: </w:t>
+      </w:r>
+      <w:r>
+        <w:rPr>
+          <w:sz w:val="20"/>
+        </w:rPr>
+        <w:t>A printable copy of this activity — with its workflow diagram and data files — is in the activities/activity03/ folder of the course repository.</w:t>
+      </w:r>
+    </w:p>
+    <w:p/>
+    <w:p>
+      <w:pPr>
+        <w:pStyle w:val="Heading1"/>
+      </w:pPr>
+      <w:r>
+        <w:t>Topic 02 — Financial Forecasting</w:t>
+      </w:r>
+    </w:p>
+    <w:p>
+      <w:r>
+        <w:t>Key principles of accounting · Key principles of corporate finance · Time value of money  (A2, K2)</w:t>
+      </w:r>
+    </w:p>
+    <w:p>
+      <w:r>
+        <w:rPr>
+          <w:b/>
+          <w:color w:val="1F6FEB"/>
+          <w:sz w:val="22"/>
+        </w:rPr>
         <w:t>Key concepts</w:t>
       </w:r>
     </w:p>
@@ -2144,7 +2836,7 @@
         <w:pStyle w:val="Heading2"/>
       </w:pPr>
       <w:r>
-        <w:t>Lab 4 — Financial Forecasting with Xero</w:t>
+        <w:t>Activity 4 — Financial Forecasting with Xero</w:t>
       </w:r>
     </w:p>
     <w:p>
@@ -2185,7 +2877,7 @@
               <a:graphicData uri="http://schemas.openxmlformats.org/drawingml/2006/picture">
                 <pic:pic>
                   <pic:nvPicPr>
-                    <pic:cNvPr id="0" name="lab-04-workflow.png"/>
+                    <pic:cNvPr id="0" name="activity-04-workflow.png"/>
                     <pic:cNvPicPr/>
                   </pic:nvPicPr>
                   <pic:blipFill>
@@ -2215,7 +2907,7 @@
           <w:color w:val="555B66"/>
           <w:sz w:val="18"/>
         </w:rPr>
-        <w:t>Lab 4 workflow — Financial Forecasting with Xero</w:t>
+        <w:t>Activity 4 workflow — Financial Forecasting with Xero</w:t>
       </w:r>
     </w:p>
     <w:p>
@@ -2385,41 +3077,23 @@
           <w:color w:val="1F6FEB"/>
           <w:sz w:val="22"/>
         </w:rPr>
-        <w:t>Check your work</w:t>
-      </w:r>
-    </w:p>
-    <w:p>
-      <w:r>
-        <w:t>Your Budget Manager forecast reflects every assumption (10% MoM sales growth, 5% commission, 2% discount, 55% direct costs, new office from June, +3 headcount from July, $30k/month depreciation) and you can justify the method used for each line.</w:t>
-      </w:r>
-    </w:p>
-    <w:p>
-      <w:r>
-        <w:rPr>
-          <w:b/>
-          <w:color w:val="1F6FEB"/>
-        </w:rPr>
-        <w:t xml:space="preserve">Note: </w:t>
-      </w:r>
-      <w:r>
-        <w:rPr>
-          <w:sz w:val="20"/>
-        </w:rPr>
-        <w:t>A printable copy of this activity is in labs/lab-04-*.md in the course repository.</w:t>
-      </w:r>
-    </w:p>
-    <w:p/>
-    <w:p>
-      <w:pPr>
-        <w:pStyle w:val="Heading1"/>
-      </w:pPr>
-      <w:r>
-        <w:t>Topic 03 — Budget Preparation</w:t>
-      </w:r>
-    </w:p>
-    <w:p>
-      <w:r>
-        <w:t>Cash flow calculation · Preparing the budget  (A3, K3, K4)</w:t>
+        <w:t>Data files for this activity (activities/activity04/)</w:t>
+      </w:r>
+    </w:p>
+    <w:p>
+      <w:pPr>
+        <w:pStyle w:val="ListBullet"/>
+      </w:pPr>
+      <w:r>
+        <w:t>activity-04-fy2025-actuals.xlsx — FY2025 monthly actuals (the forecast baseline) plus a yellow Forecast Assumptions sheet holding every FY2026 assumption.</w:t>
+      </w:r>
+    </w:p>
+    <w:p>
+      <w:pPr>
+        <w:pStyle w:val="ListBullet"/>
+      </w:pPr>
+      <w:r>
+        <w:t>activity-04-fy2025-actuals.csv — The FY2025 actuals as plain data, Jan–Dec + Total per account.</w:t>
       </w:r>
     </w:p>
     <w:p>
@@ -2429,6 +3103,220 @@
           <w:color w:val="1F6FEB"/>
           <w:sz w:val="22"/>
         </w:rPr>
+        <w:t>Analyzing the Excel workbook — step by step</w:t>
+      </w:r>
+    </w:p>
+    <w:p>
+      <w:pPr>
+        <w:ind w:left="360" w:hanging="360"/>
+      </w:pPr>
+      <w:r>
+        <w:rPr>
+          <w:b/>
+          <w:color w:val="1F6FEB"/>
+        </w:rPr>
+        <w:t xml:space="preserve">1. </w:t>
+      </w:r>
+      <w:r>
+        <w:t>Open activities/activity04/activity-04-fy2025-actuals.xlsx. The FY2025 Actuals sheet is your baseline: Sales grew about 1.5%/month from 75,000; commission 5%, discount 2%, direct costs 55%; rent 7,500; salaries 45,000 (10 staff); depreciation 12,000; other 5,000.</w:t>
+      </w:r>
+    </w:p>
+    <w:p>
+      <w:pPr>
+        <w:ind w:left="360" w:hanging="360"/>
+      </w:pPr>
+      <w:r>
+        <w:rPr>
+          <w:b/>
+          <w:color w:val="1F6FEB"/>
+        </w:rPr>
+        <w:t xml:space="preserve">2. </w:t>
+      </w:r>
+      <w:r>
+        <w:t>Open the Forecast Assumptions sheet — the yellow cells hold every FY2026 assumption from the activity: +10% sales vs the same month last year, 5% commission, 2% discount, 55% direct costs, an extra office at 1.5× rent from June, +3 headcount at 4,500/month from July, and 30,000/month depreciation from January. Income tax is ignored.</w:t>
+      </w:r>
+    </w:p>
+    <w:p>
+      <w:pPr>
+        <w:ind w:left="360" w:hanging="360"/>
+      </w:pPr>
+      <w:r>
+        <w:rPr>
+          <w:b/>
+          <w:color w:val="1F6FEB"/>
+        </w:rPr>
+        <w:t xml:space="preserve">3. </w:t>
+      </w:r>
+      <w:r>
+        <w:t>Build the FY2026 forecast: add a new sheet (or columns) and for January compute Sales = Jan FY2025 × (1+10%); copy across all 12 months.</w:t>
+      </w:r>
+    </w:p>
+    <w:p>
+      <w:pPr>
+        <w:ind w:left="360" w:hanging="360"/>
+      </w:pPr>
+      <w:r>
+        <w:rPr>
+          <w:b/>
+          <w:color w:val="1F6FEB"/>
+        </w:rPr>
+        <w:t xml:space="preserve">4. </w:t>
+      </w:r>
+      <w:r>
+        <w:t>Derive the dependent lines with formulas referencing the assumption cells: Commission = Sales × 5%, Discount = Sales × 2%, Direct Costs = Sales × 55%.</w:t>
+      </w:r>
+    </w:p>
+    <w:p>
+      <w:pPr>
+        <w:ind w:left="360" w:hanging="360"/>
+      </w:pPr>
+      <w:r>
+        <w:rPr>
+          <w:b/>
+          <w:color w:val="1F6FEB"/>
+        </w:rPr>
+        <w:t xml:space="preserve">5. </w:t>
+      </w:r>
+      <w:r>
+        <w:t>Handle the step changes with IF or by splitting the year: Rent = 7,500 until May, then 7,500 × (1 + 1.5) from June (current office plus the new one at 1.5×); Salaries = 45,000 until June, then (10+3) × 4,500 = 58,500 from July; Depreciation = 12,000 + 30,000 = 42,000 every month.</w:t>
+      </w:r>
+    </w:p>
+    <w:p>
+      <w:pPr>
+        <w:ind w:left="360" w:hanging="360"/>
+      </w:pPr>
+      <w:r>
+        <w:rPr>
+          <w:b/>
+          <w:color w:val="1F6FEB"/>
+        </w:rPr>
+        <w:t xml:space="preserve">6. </w:t>
+      </w:r>
+      <w:r>
+        <w:t>Add a Net Surplus row = Sales − all expense lines and total the year. Identify which months turn negative after the June/July step-ups and what that means for cash planning.</w:t>
+      </w:r>
+    </w:p>
+    <w:p>
+      <w:pPr>
+        <w:ind w:left="360" w:hanging="360"/>
+      </w:pPr>
+      <w:r>
+        <w:rPr>
+          <w:b/>
+          <w:color w:val="1F6FEB"/>
+        </w:rPr>
+        <w:t xml:space="preserve">7. </w:t>
+      </w:r>
+      <w:r>
+        <w:t>Now reproduce the same forecast in Xero Budget Manager, using the workbook as your working: the Xero monthly figures must match your sheet. Be ready to justify which budgeting method (baseline / incremental / zero-based / hybrid) you applied to each line.</w:t>
+      </w:r>
+    </w:p>
+    <w:p>
+      <w:r>
+        <w:rPr>
+          <w:b/>
+          <w:color w:val="1F6FEB"/>
+          <w:sz w:val="22"/>
+        </w:rPr>
+        <w:t>Analyzing the CSV data — step by step</w:t>
+      </w:r>
+    </w:p>
+    <w:p>
+      <w:pPr>
+        <w:ind w:left="360" w:hanging="360"/>
+      </w:pPr>
+      <w:r>
+        <w:rPr>
+          <w:b/>
+          <w:color w:val="1F6FEB"/>
+        </w:rPr>
+        <w:t xml:space="preserve">1. </w:t>
+      </w:r>
+      <w:r>
+        <w:t>Import activities/activity04/activity-04-fy2025-actuals.csv into a blank spreadsheet — this is the same baseline without any formulas, as a finance system would export it.</w:t>
+      </w:r>
+    </w:p>
+    <w:p>
+      <w:pPr>
+        <w:ind w:left="360" w:hanging="360"/>
+      </w:pPr>
+      <w:r>
+        <w:rPr>
+          <w:b/>
+          <w:color w:val="1F6FEB"/>
+        </w:rPr>
+        <w:t xml:space="preserve">2. </w:t>
+      </w:r>
+      <w:r>
+        <w:t>Verify the baseline before forecasting from it: recompute one derived line (e.g. Jan Commission ÷ Jan Sales = 5%) to confirm the data is internally consistent.</w:t>
+      </w:r>
+    </w:p>
+    <w:p>
+      <w:pPr>
+        <w:ind w:left="360" w:hanging="360"/>
+      </w:pPr>
+      <w:r>
+        <w:rPr>
+          <w:b/>
+          <w:color w:val="1F6FEB"/>
+        </w:rPr>
+        <w:t xml:space="preserve">3. </w:t>
+      </w:r>
+      <w:r>
+        <w:t>Build the FY2026 forecast columns beside the imported data using the same assumption formulas as the Excel walkthrough — starting from a values-only CSV is the realistic case, since exports never carry formulas.</w:t>
+      </w:r>
+    </w:p>
+    <w:p>
+      <w:r>
+        <w:rPr>
+          <w:b/>
+          <w:color w:val="1F6FEB"/>
+          <w:sz w:val="22"/>
+        </w:rPr>
+        <w:t>Check your work</w:t>
+      </w:r>
+    </w:p>
+    <w:p>
+      <w:r>
+        <w:t>Your Budget Manager forecast reflects every assumption (10% MoM sales growth, 5% commission, 2% discount, 55% direct costs, new office from June, +3 headcount from July, $30k/month depreciation) and you can justify the method used for each line.</w:t>
+      </w:r>
+    </w:p>
+    <w:p>
+      <w:r>
+        <w:rPr>
+          <w:b/>
+          <w:color w:val="1F6FEB"/>
+        </w:rPr>
+        <w:t xml:space="preserve">Note: </w:t>
+      </w:r>
+      <w:r>
+        <w:rPr>
+          <w:sz w:val="20"/>
+        </w:rPr>
+        <w:t>A printable copy of this activity — with its workflow diagram and data files — is in the activities/activity04/ folder of the course repository.</w:t>
+      </w:r>
+    </w:p>
+    <w:p/>
+    <w:p>
+      <w:pPr>
+        <w:pStyle w:val="Heading1"/>
+      </w:pPr>
+      <w:r>
+        <w:t>Topic 03 — Budget Preparation</w:t>
+      </w:r>
+    </w:p>
+    <w:p>
+      <w:r>
+        <w:t>Cash flow calculation · Preparing the budget  (A3, K3, K4)</w:t>
+      </w:r>
+    </w:p>
+    <w:p>
+      <w:r>
+        <w:rPr>
+          <w:b/>
+          <w:color w:val="1F6FEB"/>
+          <w:sz w:val="22"/>
+        </w:rPr>
         <w:t>Key concepts</w:t>
       </w:r>
     </w:p>
@@ -2485,7 +3373,7 @@
         <w:pStyle w:val="Heading2"/>
       </w:pPr>
       <w:r>
-        <w:t>Lab 5 — Master Budget Preparation — 99 Agency Case Study</w:t>
+        <w:t>Activity 5 — Master Budget Preparation — 99 Agency Case Study</w:t>
       </w:r>
     </w:p>
     <w:p>
@@ -2526,7 +3414,7 @@
               <a:graphicData uri="http://schemas.openxmlformats.org/drawingml/2006/picture">
                 <pic:pic>
                   <pic:nvPicPr>
-                    <pic:cNvPr id="0" name="lab-05-workflow.png"/>
+                    <pic:cNvPr id="0" name="activity-05-workflow.png"/>
                     <pic:cNvPicPr/>
                   </pic:nvPicPr>
                   <pic:blipFill>
@@ -2556,7 +3444,7 @@
           <w:color w:val="555B66"/>
           <w:sz w:val="18"/>
         </w:rPr>
-        <w:t>Lab 5 workflow — Master Budget Preparation — 99 Agency Case Study</w:t>
+        <w:t>Activity 5 workflow — Master Budget Preparation — 99 Agency Case Study</w:t>
       </w:r>
     </w:p>
     <w:p>
@@ -2726,41 +3614,31 @@
           <w:color w:val="1F6FEB"/>
           <w:sz w:val="22"/>
         </w:rPr>
-        <w:t>Check your work</w:t>
-      </w:r>
-    </w:p>
-    <w:p>
-      <w:r>
-        <w:t>Your 99 Agency Master Budget consolidates all seven schedules; the Balance Sheet balances, closing cash ties across statements, and you presented the budget with its assumptions.</w:t>
-      </w:r>
-    </w:p>
-    <w:p>
-      <w:r>
-        <w:rPr>
-          <w:b/>
-          <w:color w:val="1F6FEB"/>
-        </w:rPr>
-        <w:t xml:space="preserve">Note: </w:t>
-      </w:r>
-      <w:r>
-        <w:rPr>
-          <w:sz w:val="20"/>
-        </w:rPr>
-        <w:t>A printable copy of this activity is in labs/lab-05-*.md in the course repository.</w:t>
-      </w:r>
-    </w:p>
-    <w:p/>
-    <w:p>
-      <w:pPr>
-        <w:pStyle w:val="Heading1"/>
-      </w:pPr>
-      <w:r>
-        <w:t>Topic 04 — Budget Control Plan</w:t>
-      </w:r>
-    </w:p>
-    <w:p>
-      <w:r>
-        <w:t>Preparing the budget control plan · Budgetary control techniques  (A4, K5, K7)</w:t>
+        <w:t>Data files for this activity (activities/activity05/)</w:t>
+      </w:r>
+    </w:p>
+    <w:p>
+      <w:pPr>
+        <w:pStyle w:val="ListBullet"/>
+      </w:pPr>
+      <w:r>
+        <w:t>activity-05-99-agency-template.xlsx — The 99 Agency master-budget working template — Assumptions, Revenue and Cost of Sales schedules pre-wired; SG&amp;A, Fixed Assets, Working Capital, Liabilities and Master Budget sheets to build.</w:t>
+      </w:r>
+    </w:p>
+    <w:p>
+      <w:pPr>
+        <w:pStyle w:val="ListBullet"/>
+      </w:pPr>
+      <w:r>
+        <w:t>activity-05-client-baseline.csv — Per-client FY2025 revenue and expected FY2026 growth (the bottom-up input).</w:t>
+      </w:r>
+    </w:p>
+    <w:p>
+      <w:pPr>
+        <w:pStyle w:val="ListBullet"/>
+      </w:pPr>
+      <w:r>
+        <w:t>activity-05-assumptions.csv — Every case assumption as plain data.</w:t>
       </w:r>
     </w:p>
     <w:p>
@@ -2770,6 +3648,250 @@
           <w:color w:val="1F6FEB"/>
           <w:sz w:val="22"/>
         </w:rPr>
+        <w:t>Analyzing the Excel workbook — step by step</w:t>
+      </w:r>
+    </w:p>
+    <w:p>
+      <w:pPr>
+        <w:ind w:left="360" w:hanging="360"/>
+      </w:pPr>
+      <w:r>
+        <w:rPr>
+          <w:b/>
+          <w:color w:val="1F6FEB"/>
+        </w:rPr>
+        <w:t xml:space="preserve">1. </w:t>
+      </w:r>
+      <w:r>
+        <w:t>Open activities/activity05/activity-05-99-agency-template.xlsx. The Assumptions sheet holds every case parameter in blue — market size 12m × 12% share, cost-of-sales rates, fixed and variable SG&amp;A, quarterly CAPEX (40k/60k/25k/80k), 10% depreciation on beginning fixed assets of 400k, liabilities falling from 3.2m to 2.8m at 5% interest, and AR/AP days.</w:t>
+      </w:r>
+    </w:p>
+    <w:p>
+      <w:pPr>
+        <w:ind w:left="360" w:hanging="360"/>
+      </w:pPr>
+      <w:r>
+        <w:rPr>
+          <w:b/>
+          <w:color w:val="1F6FEB"/>
+        </w:rPr>
+        <w:t xml:space="preserve">2. </w:t>
+      </w:r>
+      <w:r>
+        <w:t>STEP 1 — open the '1 Revenue' sheet. The bottom-up plan is pre-wired: each client's FY2026 revenue = FY2025 × (1 + growth) — click D4 and read =B4*(1+C4). The top-down target pulls from the Assumptions sheet (=Assumptions!B4*Assumptions!B5 = 1,440,000), and the yellow committee cell takes the AVERAGE of bottom-up and top-down. Confirm the bottom-up total is 1,534,800 and the committee target 1,487,400.</w:t>
+      </w:r>
+    </w:p>
+    <w:p>
+      <w:pPr>
+        <w:ind w:left="360" w:hanging="360"/>
+      </w:pPr>
+      <w:r>
+        <w:rPr>
+          <w:b/>
+          <w:color w:val="1F6FEB"/>
+        </w:rPr>
+        <w:t xml:space="preserve">3. </w:t>
+      </w:r>
+      <w:r>
+        <w:t>STEP 2 — open '2 Cost of Sales': revenue is split 60% Ad / 40% SEO, and each stream is costed at its Assumptions rate (30% / 25%). Trace each formula back to the sheets it references — this is the baseline + averaging method from the slides.</w:t>
+      </w:r>
+    </w:p>
+    <w:p>
+      <w:pPr>
+        <w:ind w:left="360" w:hanging="360"/>
+      </w:pPr>
+      <w:r>
+        <w:rPr>
+          <w:b/>
+          <w:color w:val="1F6FEB"/>
+        </w:rPr>
+        <w:t xml:space="preserve">4. </w:t>
+      </w:r>
+      <w:r>
+        <w:t>STEP 3 — build the '3 SGA' sheet: list the six fixed fees from Assumptions (rent 60k, accounting 12k, legal 8k, training 10k, management salaries 180k, admin 24k), then add the two variable lines = committee revenue × 4% (external services) and × 3% (selling commissions). Total the SG&amp;A.</w:t>
+      </w:r>
+    </w:p>
+    <w:p>
+      <w:pPr>
+        <w:ind w:left="360" w:hanging="360"/>
+      </w:pPr>
+      <w:r>
+        <w:rPr>
+          <w:b/>
+          <w:color w:val="1F6FEB"/>
+        </w:rPr>
+        <w:t xml:space="preserve">5. </w:t>
+      </w:r>
+      <w:r>
+        <w:t>STEP 4 — build '4 Fixed Assets': beginning fixed assets 400,000 + the four quarterly CAPEX amounts = closing gross assets 605,000; depreciation = 10% × beginning fixed assets = 40,000; closing net assets = closing gross − accumulated depreciation.</w:t>
+      </w:r>
+    </w:p>
+    <w:p>
+      <w:pPr>
+        <w:ind w:left="360" w:hanging="360"/>
+      </w:pPr>
+      <w:r>
+        <w:rPr>
+          <w:b/>
+          <w:color w:val="1F6FEB"/>
+        </w:rPr>
+        <w:t xml:space="preserve">6. </w:t>
+      </w:r>
+      <w:r>
+        <w:t>STEP 5 — build '5 Working Capital': Accounts Receivable = committee revenue × 45/365; Accounts Payable = total cost of sales × 30/365. Working capital = AR − AP.</w:t>
+      </w:r>
+    </w:p>
+    <w:p>
+      <w:pPr>
+        <w:ind w:left="360" w:hanging="360"/>
+      </w:pPr>
+      <w:r>
+        <w:rPr>
+          <w:b/>
+          <w:color w:val="1F6FEB"/>
+        </w:rPr>
+        <w:t xml:space="preserve">7. </w:t>
+      </w:r>
+      <w:r>
+        <w:t>STEP 6 — build '6 Liabilities': beginning 3,200,000, ending 2,800,000 (repayment 400,000); interest expense = 5% × average balance ( (3.2m+2.8m)/2 × 5% = 150,000 ).</w:t>
+      </w:r>
+    </w:p>
+    <w:p>
+      <w:pPr>
+        <w:ind w:left="360" w:hanging="360"/>
+      </w:pPr>
+      <w:r>
+        <w:rPr>
+          <w:b/>
+          <w:color w:val="1F6FEB"/>
+        </w:rPr>
+        <w:t xml:space="preserve">8. </w:t>
+      </w:r>
+      <w:r>
+        <w:t>STEP 7 — build '7 Master Budget': compile the Income Statement (committee revenue − cost of sales − SG&amp;A − depreciation − interest = net profit), then the Balance Sheet (net fixed assets, AR, cash; liabilities and equity with retained earnings up by net profit) and the Cash Flow. Check: the Balance Sheet balances and closing cash ties to the Cash Flow.</w:t>
+      </w:r>
+    </w:p>
+    <w:p>
+      <w:pPr>
+        <w:ind w:left="360" w:hanging="360"/>
+      </w:pPr>
+      <w:r>
+        <w:rPr>
+          <w:b/>
+          <w:color w:val="1F6FEB"/>
+        </w:rPr>
+        <w:t xml:space="preserve">9. </w:t>
+      </w:r>
+      <w:r>
+        <w:t>Present your consolidated Master Budget: show the committee revenue decision, the schedule totals and the final three statements.</w:t>
+      </w:r>
+    </w:p>
+    <w:p>
+      <w:r>
+        <w:rPr>
+          <w:b/>
+          <w:color w:val="1F6FEB"/>
+          <w:sz w:val="22"/>
+        </w:rPr>
+        <w:t>Analyzing the CSV data — step by step</w:t>
+      </w:r>
+    </w:p>
+    <w:p>
+      <w:pPr>
+        <w:ind w:left="360" w:hanging="360"/>
+      </w:pPr>
+      <w:r>
+        <w:rPr>
+          <w:b/>
+          <w:color w:val="1F6FEB"/>
+        </w:rPr>
+        <w:t xml:space="preserve">1. </w:t>
+      </w:r>
+      <w:r>
+        <w:t>Open activities/activity05/activity-05-client-baseline.csv — the raw bottom-up input: five client rows with FY2025 revenue and expected growth. Import it into a blank sheet and recompute the bottom-up total (Σ revenue × (1+growth)) = 1,534,800 to verify it matches the template.</w:t>
+      </w:r>
+    </w:p>
+    <w:p>
+      <w:pPr>
+        <w:ind w:left="360" w:hanging="360"/>
+      </w:pPr>
+      <w:r>
+        <w:rPr>
+          <w:b/>
+          <w:color w:val="1F6FEB"/>
+        </w:rPr>
+        <w:t xml:space="preserve">2. </w:t>
+      </w:r>
+      <w:r>
+        <w:t>Open activities/activity05/activity-05-assumptions.csv — every assumption as data. Use it as your checklist while building STEP 3–7: tick each assumption off as your schedules consume it; an unused assumption means a schedule is incomplete.</w:t>
+      </w:r>
+    </w:p>
+    <w:p>
+      <w:pPr>
+        <w:ind w:left="360" w:hanging="360"/>
+      </w:pPr>
+      <w:r>
+        <w:rPr>
+          <w:b/>
+          <w:color w:val="1F6FEB"/>
+        </w:rPr>
+        <w:t xml:space="preserve">3. </w:t>
+      </w:r>
+      <w:r>
+        <w:t>If you prefer building from scratch, import both CSVs into one workbook and construct the whole 7-schedule model from the raw data instead of the pre-wired template — the totals must come out identical.</w:t>
+      </w:r>
+    </w:p>
+    <w:p>
+      <w:r>
+        <w:rPr>
+          <w:b/>
+          <w:color w:val="1F6FEB"/>
+          <w:sz w:val="22"/>
+        </w:rPr>
+        <w:t>Check your work</w:t>
+      </w:r>
+    </w:p>
+    <w:p>
+      <w:r>
+        <w:t>Your 99 Agency Master Budget consolidates all seven schedules; the Balance Sheet balances, closing cash ties across statements, and you presented the budget with its assumptions.</w:t>
+      </w:r>
+    </w:p>
+    <w:p>
+      <w:r>
+        <w:rPr>
+          <w:b/>
+          <w:color w:val="1F6FEB"/>
+        </w:rPr>
+        <w:t xml:space="preserve">Note: </w:t>
+      </w:r>
+      <w:r>
+        <w:rPr>
+          <w:sz w:val="20"/>
+        </w:rPr>
+        <w:t>A printable copy of this activity — with its workflow diagram and data files — is in the activities/activity05/ folder of the course repository.</w:t>
+      </w:r>
+    </w:p>
+    <w:p/>
+    <w:p>
+      <w:pPr>
+        <w:pStyle w:val="Heading1"/>
+      </w:pPr>
+      <w:r>
+        <w:t>Topic 04 — Budget Control Plan</w:t>
+      </w:r>
+    </w:p>
+    <w:p>
+      <w:r>
+        <w:t>Preparing the budget control plan · Budgetary control techniques  (A4, K5, K7)</w:t>
+      </w:r>
+    </w:p>
+    <w:p>
+      <w:r>
+        <w:rPr>
+          <w:b/>
+          <w:color w:val="1F6FEB"/>
+          <w:sz w:val="22"/>
+        </w:rPr>
         <w:t>Key concepts</w:t>
       </w:r>
     </w:p>
@@ -2826,7 +3948,7 @@
         <w:pStyle w:val="Heading2"/>
       </w:pPr>
       <w:r>
-        <w:t>Lab 6 — Knowledge Check Quiz — Budget Control</w:t>
+        <w:t>Activity 6 — Knowledge Check Quiz — Budget Control</w:t>
       </w:r>
     </w:p>
     <w:p>
@@ -2867,7 +3989,7 @@
               <a:graphicData uri="http://schemas.openxmlformats.org/drawingml/2006/picture">
                 <pic:pic>
                   <pic:nvPicPr>
-                    <pic:cNvPr id="0" name="lab-06-workflow.png"/>
+                    <pic:cNvPr id="0" name="activity-06-workflow.png"/>
                     <pic:cNvPicPr/>
                   </pic:nvPicPr>
                   <pic:blipFill>
@@ -2897,7 +4019,7 @@
           <w:color w:val="555B66"/>
           <w:sz w:val="18"/>
         </w:rPr>
-        <w:t>Lab 6 workflow — Knowledge Check Quiz — Budget Control</w:t>
+        <w:t>Activity 6 workflow — Knowledge Check Quiz — Budget Control</w:t>
       </w:r>
     </w:p>
     <w:p>
@@ -2977,41 +4099,23 @@
           <w:color w:val="1F6FEB"/>
           <w:sz w:val="22"/>
         </w:rPr>
-        <w:t>Check your work</w:t>
-      </w:r>
-    </w:p>
-    <w:p>
-      <w:r>
-        <w:t>You submitted the quiz and can explain any question you got wrong — especially the three types of budget control and the corrective-action loop.</w:t>
-      </w:r>
-    </w:p>
-    <w:p>
-      <w:r>
-        <w:rPr>
-          <w:b/>
-          <w:color w:val="1F6FEB"/>
-        </w:rPr>
-        <w:t xml:space="preserve">Note: </w:t>
-      </w:r>
-      <w:r>
-        <w:rPr>
-          <w:sz w:val="20"/>
-        </w:rPr>
-        <w:t>A printable copy of this activity is in labs/lab-06-*.md in the course repository.</w:t>
-      </w:r>
-    </w:p>
-    <w:p/>
-    <w:p>
-      <w:pPr>
-        <w:pStyle w:val="Heading1"/>
-      </w:pPr>
-      <w:r>
-        <w:t>Topic 05 — Budget Analysis</w:t>
-      </w:r>
-    </w:p>
-    <w:p>
-      <w:r>
-        <w:t>Compare budget with estimation · Financial methodologies for budget control  (A5, K8, K9)</w:t>
+        <w:t>Data files for this activity (activities/activity06/)</w:t>
+      </w:r>
+    </w:p>
+    <w:p>
+      <w:pPr>
+        <w:pStyle w:val="ListBullet"/>
+      </w:pPr>
+      <w:r>
+        <w:t>activity-06-budget-control-monitor.xlsx — Six departments' mid-year budget vs actual with live variance, variance-% and a REVIEW/OK status driven by a 10% threshold cell.</w:t>
+      </w:r>
+    </w:p>
+    <w:p>
+      <w:pPr>
+        <w:pStyle w:val="ListBullet"/>
+      </w:pPr>
+      <w:r>
+        <w:t>activity-06-budget-control-monitor.csv — The same monitor as plain data (no formulas) for you to rebuild.</w:t>
       </w:r>
     </w:p>
     <w:p>
@@ -3021,6 +4125,205 @@
           <w:color w:val="1F6FEB"/>
           <w:sz w:val="22"/>
         </w:rPr>
+        <w:t>Analyzing the Excel workbook — step by step</w:t>
+      </w:r>
+    </w:p>
+    <w:p>
+      <w:pPr>
+        <w:ind w:left="360" w:hanging="360"/>
+      </w:pPr>
+      <w:r>
+        <w:rPr>
+          <w:b/>
+          <w:color w:val="1F6FEB"/>
+        </w:rPr>
+        <w:t xml:space="preserve">1. </w:t>
+      </w:r>
+      <w:r>
+        <w:t>Open activities/activity06/activity-06-budget-control-monitor.xlsx before attempting the quiz — it makes the control-loop concepts concrete.</w:t>
+      </w:r>
+    </w:p>
+    <w:p>
+      <w:pPr>
+        <w:ind w:left="360" w:hanging="360"/>
+      </w:pPr>
+      <w:r>
+        <w:rPr>
+          <w:b/>
+          <w:color w:val="1F6FEB"/>
+        </w:rPr>
+        <w:t xml:space="preserve">2. </w:t>
+      </w:r>
+      <w:r>
+        <w:t>Read row by row: each department has an Annual Budget, YTD Budget and YTD Actual. Variance = Actual − Budget (=D5-C5) and Var % = Variance ÷ YTD Budget.</w:t>
+      </w:r>
+    </w:p>
+    <w:p>
+      <w:pPr>
+        <w:ind w:left="360" w:hanging="360"/>
+      </w:pPr>
+      <w:r>
+        <w:rPr>
+          <w:b/>
+          <w:color w:val="1F6FEB"/>
+        </w:rPr>
+        <w:t xml:space="preserve">3. </w:t>
+      </w:r>
+      <w:r>
+        <w:t>Click a Status cell and read the control formula: =IF(ABS(F5)&gt;$B$2,"REVIEW","OK") — any department whose absolute variance % exceeds the yellow threshold cell (10%) is flagged for corrective action. This IS budgetary control: compare, investigate, correct.</w:t>
+      </w:r>
+    </w:p>
+    <w:p>
+      <w:pPr>
+        <w:ind w:left="360" w:hanging="360"/>
+      </w:pPr>
+      <w:r>
+        <w:rPr>
+          <w:b/>
+          <w:color w:val="1F6FEB"/>
+        </w:rPr>
+        <w:t xml:space="preserve">4. </w:t>
+      </w:r>
+      <w:r>
+        <w:t>Identify the flagged departments (Marketing overspend ≈ +19%, Operations ≈ +9%) and, for each, say which control applies — operating, cash flow or capital-expenditure control — and what corrective action you would take.</w:t>
+      </w:r>
+    </w:p>
+    <w:p>
+      <w:pPr>
+        <w:ind w:left="360" w:hanging="360"/>
+      </w:pPr>
+      <w:r>
+        <w:rPr>
+          <w:b/>
+          <w:color w:val="1F6FEB"/>
+        </w:rPr>
+        <w:t xml:space="preserve">5. </w:t>
+      </w:r>
+      <w:r>
+        <w:t>Change the threshold from 10% to 5% and watch more departments flip to REVIEW — thresholds decide how much management attention the process demands. Undo when done.</w:t>
+      </w:r>
+    </w:p>
+    <w:p>
+      <w:pPr>
+        <w:ind w:left="360" w:hanging="360"/>
+      </w:pPr>
+      <w:r>
+        <w:rPr>
+          <w:b/>
+          <w:color w:val="1F6FEB"/>
+        </w:rPr>
+        <w:t xml:space="preserve">6. </w:t>
+      </w:r>
+      <w:r>
+        <w:t>Now take the Google Form quiz; use the workbook to reason about the control-process questions.</w:t>
+      </w:r>
+    </w:p>
+    <w:p>
+      <w:r>
+        <w:rPr>
+          <w:b/>
+          <w:color w:val="1F6FEB"/>
+          <w:sz w:val="22"/>
+        </w:rPr>
+        <w:t>Analyzing the CSV data — step by step</w:t>
+      </w:r>
+    </w:p>
+    <w:p>
+      <w:pPr>
+        <w:ind w:left="360" w:hanging="360"/>
+      </w:pPr>
+      <w:r>
+        <w:rPr>
+          <w:b/>
+          <w:color w:val="1F6FEB"/>
+        </w:rPr>
+        <w:t xml:space="preserve">1. </w:t>
+      </w:r>
+      <w:r>
+        <w:t>Import activities/activity06/activity-06-budget-control-monitor.csv into a blank spreadsheet — it has only the three data columns per department.</w:t>
+      </w:r>
+    </w:p>
+    <w:p>
+      <w:pPr>
+        <w:ind w:left="360" w:hanging="360"/>
+      </w:pPr>
+      <w:r>
+        <w:rPr>
+          <w:b/>
+          <w:color w:val="1F6FEB"/>
+        </w:rPr>
+        <w:t xml:space="preserve">2. </w:t>
+      </w:r>
+      <w:r>
+        <w:t>Rebuild the monitor yourself: add Variance, Var % and Status columns with the formulas from the Excel walkthrough. Getting the IF/ABS threshold formula right is the point of the exercise.</w:t>
+      </w:r>
+    </w:p>
+    <w:p>
+      <w:pPr>
+        <w:ind w:left="360" w:hanging="360"/>
+      </w:pPr>
+      <w:r>
+        <w:rPr>
+          <w:b/>
+          <w:color w:val="1F6FEB"/>
+        </w:rPr>
+        <w:t xml:space="preserve">3. </w:t>
+      </w:r>
+      <w:r>
+        <w:t>Check your rebuilt monitor flags exactly the same departments as the workbook.</w:t>
+      </w:r>
+    </w:p>
+    <w:p>
+      <w:r>
+        <w:rPr>
+          <w:b/>
+          <w:color w:val="1F6FEB"/>
+          <w:sz w:val="22"/>
+        </w:rPr>
+        <w:t>Check your work</w:t>
+      </w:r>
+    </w:p>
+    <w:p>
+      <w:r>
+        <w:t>You submitted the quiz and can explain any question you got wrong — especially the three types of budget control and the corrective-action loop.</w:t>
+      </w:r>
+    </w:p>
+    <w:p>
+      <w:r>
+        <w:rPr>
+          <w:b/>
+          <w:color w:val="1F6FEB"/>
+        </w:rPr>
+        <w:t xml:space="preserve">Note: </w:t>
+      </w:r>
+      <w:r>
+        <w:rPr>
+          <w:sz w:val="20"/>
+        </w:rPr>
+        <w:t>A printable copy of this activity — with its workflow diagram and data files — is in the activities/activity06/ folder of the course repository.</w:t>
+      </w:r>
+    </w:p>
+    <w:p/>
+    <w:p>
+      <w:pPr>
+        <w:pStyle w:val="Heading1"/>
+      </w:pPr>
+      <w:r>
+        <w:t>Topic 05 — Budget Analysis</w:t>
+      </w:r>
+    </w:p>
+    <w:p>
+      <w:r>
+        <w:t>Compare budget with estimation · Financial methodologies for budget control  (A5, K8, K9)</w:t>
+      </w:r>
+    </w:p>
+    <w:p>
+      <w:r>
+        <w:rPr>
+          <w:b/>
+          <w:color w:val="1F6FEB"/>
+          <w:sz w:val="22"/>
+        </w:rPr>
         <w:t>Key concepts</w:t>
       </w:r>
     </w:p>
@@ -3077,7 +4380,7 @@
         <w:pStyle w:val="Heading2"/>
       </w:pPr>
       <w:r>
-        <w:t>Lab 7 — Budget Variance Analysis in Xero</w:t>
+        <w:t>Activity 7 — Budget Variance Analysis in Xero</w:t>
       </w:r>
     </w:p>
     <w:p>
@@ -3118,7 +4421,7 @@
               <a:graphicData uri="http://schemas.openxmlformats.org/drawingml/2006/picture">
                 <pic:pic>
                   <pic:nvPicPr>
-                    <pic:cNvPr id="0" name="lab-07-workflow.png"/>
+                    <pic:cNvPr id="0" name="activity-07-workflow.png"/>
                     <pic:cNvPicPr/>
                   </pic:nvPicPr>
                   <pic:blipFill>
@@ -3148,7 +4451,7 @@
           <w:color w:val="555B66"/>
           <w:sz w:val="18"/>
         </w:rPr>
-        <w:t>Lab 7 workflow — Budget Variance Analysis in Xero</w:t>
+        <w:t>Activity 7 workflow — Budget Variance Analysis in Xero</w:t>
       </w:r>
     </w:p>
     <w:p>
@@ -3258,6 +4561,210 @@
           <w:color w:val="1F6FEB"/>
           <w:sz w:val="22"/>
         </w:rPr>
+        <w:t>Data files for this activity (activities/activity07/)</w:t>
+      </w:r>
+    </w:p>
+    <w:p>
+      <w:pPr>
+        <w:pStyle w:val="ListBullet"/>
+      </w:pPr>
+      <w:r>
+        <w:t>activity-07-budget-vs-actual.xlsx — Budget and Actual sheets (8 accounts × 12 months) plus a Variance sheet that classifies every line Favourable/Adverse against a threshold.</w:t>
+      </w:r>
+    </w:p>
+    <w:p>
+      <w:pPr>
+        <w:pStyle w:val="ListBullet"/>
+      </w:pPr>
+      <w:r>
+        <w:t>activity-07-budget.csv — The budget as plain data.</w:t>
+      </w:r>
+    </w:p>
+    <w:p>
+      <w:pPr>
+        <w:pStyle w:val="ListBullet"/>
+      </w:pPr>
+      <w:r>
+        <w:t>activity-07-actual.csv — The actuals as plain data.</w:t>
+      </w:r>
+    </w:p>
+    <w:p>
+      <w:r>
+        <w:rPr>
+          <w:b/>
+          <w:color w:val="1F6FEB"/>
+          <w:sz w:val="22"/>
+        </w:rPr>
+        <w:t>Analyzing the Excel workbook — step by step</w:t>
+      </w:r>
+    </w:p>
+    <w:p>
+      <w:pPr>
+        <w:ind w:left="360" w:hanging="360"/>
+      </w:pPr>
+      <w:r>
+        <w:rPr>
+          <w:b/>
+          <w:color w:val="1F6FEB"/>
+        </w:rPr>
+        <w:t xml:space="preserve">1. </w:t>
+      </w:r>
+      <w:r>
+        <w:t>Open activities/activity07/activity-07-budget-vs-actual.xlsx. The Budget and Actual sheets hold the same 8 accounts across Jan–Dec; actuals deviate from budget (Sales ran ~3% under, Marketing ~28% over, Direct Costs ~4% over…).</w:t>
+      </w:r>
+    </w:p>
+    <w:p>
+      <w:pPr>
+        <w:ind w:left="360" w:hanging="360"/>
+      </w:pPr>
+      <w:r>
+        <w:rPr>
+          <w:b/>
+          <w:color w:val="1F6FEB"/>
+        </w:rPr>
+        <w:t xml:space="preserve">2. </w:t>
+      </w:r>
+      <w:r>
+        <w:t>Open the Variance sheet: Budget and Actual totals are pulled cross-sheet (=Budget!N4, =Actual!N4 — green-style links), Variance = Actual − Budget, Var % = Variance ÷ Budget.</w:t>
+      </w:r>
+    </w:p>
+    <w:p>
+      <w:pPr>
+        <w:ind w:left="360" w:hanging="360"/>
+      </w:pPr>
+      <w:r>
+        <w:rPr>
+          <w:b/>
+          <w:color w:val="1F6FEB"/>
+        </w:rPr>
+        <w:t xml:space="preserve">3. </w:t>
+      </w:r>
+      <w:r>
+        <w:t>Study the Classification formula: for an income account a positive variance is Favourable; for an expense account a NEGATIVE variance is Favourable — click G5 and read the nested IF that encodes this. This distinction is the heart of variance analysis.</w:t>
+      </w:r>
+    </w:p>
+    <w:p>
+      <w:pPr>
+        <w:ind w:left="360" w:hanging="360"/>
+      </w:pPr>
+      <w:r>
+        <w:rPr>
+          <w:b/>
+          <w:color w:val="1F6FEB"/>
+        </w:rPr>
+        <w:t xml:space="preserve">4. </w:t>
+      </w:r>
+      <w:r>
+        <w:t>Identify every Adverse line above the 10% threshold (Marketing +28%) and every Favourable one (Other Expenses −8%). Substantiate each as the budget manager: what business events explain it?</w:t>
+      </w:r>
+    </w:p>
+    <w:p>
+      <w:pPr>
+        <w:ind w:left="360" w:hanging="360"/>
+      </w:pPr>
+      <w:r>
+        <w:rPr>
+          <w:b/>
+          <w:color w:val="1F6FEB"/>
+        </w:rPr>
+        <w:t xml:space="preserve">5. </w:t>
+      </w:r>
+      <w:r>
+        <w:t>Sales is under budget by ~3% — express the variance in dollars AND as a % (the Budget-to-Actual report style from the slides: e.g. budget 500,000, actual 400,000 → (100,000) and (20%)).</w:t>
+      </w:r>
+    </w:p>
+    <w:p>
+      <w:pPr>
+        <w:ind w:left="360" w:hanging="360"/>
+      </w:pPr>
+      <w:r>
+        <w:rPr>
+          <w:b/>
+          <w:color w:val="1F6FEB"/>
+        </w:rPr>
+        <w:t xml:space="preserve">6. </w:t>
+      </w:r>
+      <w:r>
+        <w:t>Reproduce the same analysis in Xero: display your Budget Manager budget alongside actuals, and compare Xero's variance columns with the workbook's.</w:t>
+      </w:r>
+    </w:p>
+    <w:p>
+      <w:pPr>
+        <w:ind w:left="360" w:hanging="360"/>
+      </w:pPr>
+      <w:r>
+        <w:rPr>
+          <w:b/>
+          <w:color w:val="1F6FEB"/>
+        </w:rPr>
+        <w:t xml:space="preserve">7. </w:t>
+      </w:r>
+      <w:r>
+        <w:t>Write your variance analysis report: each material variance, its classification, substantiation, and the corrective action — then present it to the class.</w:t>
+      </w:r>
+    </w:p>
+    <w:p>
+      <w:r>
+        <w:rPr>
+          <w:b/>
+          <w:color w:val="1F6FEB"/>
+          <w:sz w:val="22"/>
+        </w:rPr>
+        <w:t>Analyzing the CSV data — step by step</w:t>
+      </w:r>
+    </w:p>
+    <w:p>
+      <w:pPr>
+        <w:ind w:left="360" w:hanging="360"/>
+      </w:pPr>
+      <w:r>
+        <w:rPr>
+          <w:b/>
+          <w:color w:val="1F6FEB"/>
+        </w:rPr>
+        <w:t xml:space="preserve">1. </w:t>
+      </w:r>
+      <w:r>
+        <w:t>Import both activities/activity07/activity-07-budget.csv and activities/activity07/activity-07-actual.csv into ONE spreadsheet on two sheets — this simulates receiving separate system exports.</w:t>
+      </w:r>
+    </w:p>
+    <w:p>
+      <w:pPr>
+        <w:ind w:left="360" w:hanging="360"/>
+      </w:pPr>
+      <w:r>
+        <w:rPr>
+          <w:b/>
+          <w:color w:val="1F6FEB"/>
+        </w:rPr>
+        <w:t xml:space="preserve">2. </w:t>
+      </w:r>
+      <w:r>
+        <w:t>Build your own Variance sheet from scratch: reference the two imported sheets, compute Variance and Var %, and add the income-vs-expense Favourable/Adverse IF formula.</w:t>
+      </w:r>
+    </w:p>
+    <w:p>
+      <w:pPr>
+        <w:ind w:left="360" w:hanging="360"/>
+      </w:pPr>
+      <w:r>
+        <w:rPr>
+          <w:b/>
+          <w:color w:val="1F6FEB"/>
+        </w:rPr>
+        <w:t xml:space="preserve">3. </w:t>
+      </w:r>
+      <w:r>
+        <w:t>Cross-check your computed variances against the workbook's Variance sheet — every figure must match. If one differs, find whether your cross-sheet reference points at the wrong row (the classic variance-report bug).</w:t>
+      </w:r>
+    </w:p>
+    <w:p>
+      <w:r>
+        <w:rPr>
+          <w:b/>
+          <w:color w:val="1F6FEB"/>
+          <w:sz w:val="22"/>
+        </w:rPr>
         <w:t>Check your work</w:t>
       </w:r>
     </w:p>
@@ -3278,7 +4785,7 @@
         <w:rPr>
           <w:sz w:val="20"/>
         </w:rPr>
-        <w:t>A printable copy of this activity is in labs/lab-07-*.md in the course repository.</w:t>
+        <w:t>A printable copy of this activity — with its workflow diagram and data files — is in the activities/activity07/ folder of the course repository.</w:t>
       </w:r>
     </w:p>
     <w:p/>
@@ -3287,7 +4794,7 @@
         <w:pStyle w:val="Heading2"/>
       </w:pPr>
       <w:r>
-        <w:t>Lab 8 — Budget Analysis Dashboard with Power BI</w:t>
+        <w:t>Activity 8 — Budget Analysis Dashboard with Power BI</w:t>
       </w:r>
     </w:p>
     <w:p>
@@ -3328,7 +4835,7 @@
               <a:graphicData uri="http://schemas.openxmlformats.org/drawingml/2006/picture">
                 <pic:pic>
                   <pic:nvPicPr>
-                    <pic:cNvPr id="0" name="lab-08-workflow.png"/>
+                    <pic:cNvPr id="0" name="activity-08-workflow.png"/>
                     <pic:cNvPicPr/>
                   </pic:nvPicPr>
                   <pic:blipFill>
@@ -3358,7 +4865,7 @@
           <w:color w:val="555B66"/>
           <w:sz w:val="18"/>
         </w:rPr>
-        <w:t>Lab 8 workflow — Budget Analysis Dashboard with Power BI</w:t>
+        <w:t>Activity 8 workflow — Budget Analysis Dashboard with Power BI</w:t>
       </w:r>
     </w:p>
     <w:p>
@@ -3528,41 +5035,39 @@
           <w:color w:val="1F6FEB"/>
           <w:sz w:val="22"/>
         </w:rPr>
-        <w:t>Check your work</w:t>
-      </w:r>
-    </w:p>
-    <w:p>
-      <w:r>
-        <w:t>Power BI displays the Xero dashboard for your organisation and you can read off cash-flow, receivables and profitability insights that support budget analysis.</w:t>
-      </w:r>
-    </w:p>
-    <w:p>
-      <w:r>
-        <w:rPr>
-          <w:b/>
-          <w:color w:val="1F6FEB"/>
-        </w:rPr>
-        <w:t xml:space="preserve">Note: </w:t>
-      </w:r>
-      <w:r>
-        <w:rPr>
-          <w:sz w:val="20"/>
-        </w:rPr>
-        <w:t>A printable copy of this activity is in labs/lab-08-*.md in the course repository.</w:t>
-      </w:r>
-    </w:p>
-    <w:p/>
-    <w:p>
-      <w:pPr>
-        <w:pStyle w:val="Heading1"/>
-      </w:pPr>
-      <w:r>
-        <w:t>Topic 06 — Budget Approval</w:t>
-      </w:r>
-    </w:p>
-    <w:p>
-      <w:r>
-        <w:t>Budget approval process · Stakeholder precautions  (A6, K10)</w:t>
+        <w:t>Data files for this activity (activities/activity08/)</w:t>
+      </w:r>
+    </w:p>
+    <w:p>
+      <w:pPr>
+        <w:pStyle w:val="ListBullet"/>
+      </w:pPr>
+      <w:r>
+        <w:t>activity-08-xero-export.xlsx — A Xero-style export: 60 sales invoices, 48 supplier bills and a balanced trial balance.</w:t>
+      </w:r>
+    </w:p>
+    <w:p>
+      <w:pPr>
+        <w:pStyle w:val="ListBullet"/>
+      </w:pPr>
+      <w:r>
+        <w:t>activity-08-invoices.csv — The invoices as CSV — ready to load into Power BI.</w:t>
+      </w:r>
+    </w:p>
+    <w:p>
+      <w:pPr>
+        <w:pStyle w:val="ListBullet"/>
+      </w:pPr>
+      <w:r>
+        <w:t>activity-08-bills.csv — The bills as CSV.</w:t>
+      </w:r>
+    </w:p>
+    <w:p>
+      <w:pPr>
+        <w:pStyle w:val="ListBullet"/>
+      </w:pPr>
+      <w:r>
+        <w:t>activity-08-trial-balance.csv — The trial balance as CSV.</w:t>
       </w:r>
     </w:p>
     <w:p>
@@ -3572,6 +5077,235 @@
           <w:color w:val="1F6FEB"/>
           <w:sz w:val="22"/>
         </w:rPr>
+        <w:t>Analyzing the Excel workbook — step by step</w:t>
+      </w:r>
+    </w:p>
+    <w:p>
+      <w:pPr>
+        <w:ind w:left="360" w:hanging="360"/>
+      </w:pPr>
+      <w:r>
+        <w:rPr>
+          <w:b/>
+          <w:color w:val="1F6FEB"/>
+        </w:rPr>
+        <w:t xml:space="preserve">1. </w:t>
+      </w:r>
+      <w:r>
+        <w:t>Open activities/activity08/activity-08-xero-export.xlsx. The Invoices sheet lists six months of sales invoices (number, date, due date, contact, amount, amount paid, status); Bills is the supplier side; Trial Balance is the account-level position.</w:t>
+      </w:r>
+    </w:p>
+    <w:p>
+      <w:pPr>
+        <w:ind w:left="360" w:hanging="360"/>
+      </w:pPr>
+      <w:r>
+        <w:rPr>
+          <w:b/>
+          <w:color w:val="1F6FEB"/>
+        </w:rPr>
+        <w:t xml:space="preserve">2. </w:t>
+      </w:r>
+      <w:r>
+        <w:t>On Invoices, read the Total and Outstanding cells below the table: Outstanding = total invoiced − total paid — this is the receivables exposure a cash-flow dashboard must show.</w:t>
+      </w:r>
+    </w:p>
+    <w:p>
+      <w:pPr>
+        <w:ind w:left="360" w:hanging="360"/>
+      </w:pPr>
+      <w:r>
+        <w:rPr>
+          <w:b/>
+          <w:color w:val="1F6FEB"/>
+        </w:rPr>
+        <w:t xml:space="preserve">3. </w:t>
+      </w:r>
+      <w:r>
+        <w:t>Analyse receivables: insert a PivotTable (Insert → PivotTable) with Contact on rows and Amount − Amount Paid as values to rank customers by outstanding balance; filter Status = Authorised to isolate unpaid invoices.</w:t>
+      </w:r>
+    </w:p>
+    <w:p>
+      <w:pPr>
+        <w:ind w:left="360" w:hanging="360"/>
+      </w:pPr>
+      <w:r>
+        <w:rPr>
+          <w:b/>
+          <w:color w:val="1F6FEB"/>
+        </w:rPr>
+        <w:t xml:space="preserve">4. </w:t>
+      </w:r>
+      <w:r>
+        <w:t>Repeat on Bills for payables: which suppliers are owed the most, and in which months do payments cluster?</w:t>
+      </w:r>
+    </w:p>
+    <w:p>
+      <w:pPr>
+        <w:ind w:left="360" w:hanging="360"/>
+      </w:pPr>
+      <w:r>
+        <w:rPr>
+          <w:b/>
+          <w:color w:val="1F6FEB"/>
+        </w:rPr>
+        <w:t xml:space="preserve">5. </w:t>
+      </w:r>
+      <w:r>
+        <w:t>On Trial Balance, confirm the Balance check cell equals 0 (total debits = total credits, 1,442,000 each side) — an unbalanced TB means the export is corrupt. Identify which accounts are P&amp;L (Sales, COGS, expenses) and which are Balance Sheet.</w:t>
+      </w:r>
+    </w:p>
+    <w:p>
+      <w:pPr>
+        <w:ind w:left="360" w:hanging="360"/>
+      </w:pPr>
+      <w:r>
+        <w:rPr>
+          <w:b/>
+          <w:color w:val="1F6FEB"/>
+        </w:rPr>
+        <w:t xml:space="preserve">6. </w:t>
+      </w:r>
+      <w:r>
+        <w:t>From the TB compute profitability in spare cells: Sales − COGS − expenses = operating result; compare gross margin with Activity 1.</w:t>
+      </w:r>
+    </w:p>
+    <w:p>
+      <w:pPr>
+        <w:ind w:left="360" w:hanging="360"/>
+      </w:pPr>
+      <w:r>
+        <w:rPr>
+          <w:b/>
+          <w:color w:val="1F6FEB"/>
+        </w:rPr>
+        <w:t xml:space="preserve">7. </w:t>
+      </w:r>
+      <w:r>
+        <w:t>In Power BI Desktop (or the Power BI service), use Get Data → Excel workbook to load all three sheets and build three visuals: outstanding receivables by contact (bar), monthly invoiced vs paid (line), and expenses breakdown from the TB (donut). This mirrors what the Xero connector builds automatically.</w:t>
+      </w:r>
+    </w:p>
+    <w:p>
+      <w:r>
+        <w:rPr>
+          <w:b/>
+          <w:color w:val="1F6FEB"/>
+          <w:sz w:val="22"/>
+        </w:rPr>
+        <w:t>Analyzing the CSV data — step by step</w:t>
+      </w:r>
+    </w:p>
+    <w:p>
+      <w:pPr>
+        <w:ind w:left="360" w:hanging="360"/>
+      </w:pPr>
+      <w:r>
+        <w:rPr>
+          <w:b/>
+          <w:color w:val="1F6FEB"/>
+        </w:rPr>
+        <w:t xml:space="preserve">1. </w:t>
+      </w:r>
+      <w:r>
+        <w:t>The three CSVs are the same tables as system exports. In Power BI: Get Data → Text/CSV, load activity-08-invoices.csv, activity-08-bills.csv and activity-08-trial-balance.csv — use this route whenever the live Xero connector is unavailable in class.</w:t>
+      </w:r>
+    </w:p>
+    <w:p>
+      <w:pPr>
+        <w:ind w:left="360" w:hanging="360"/>
+      </w:pPr>
+      <w:r>
+        <w:rPr>
+          <w:b/>
+          <w:color w:val="1F6FEB"/>
+        </w:rPr>
+        <w:t xml:space="preserve">2. </w:t>
+      </w:r>
+      <w:r>
+        <w:t>In Power Query, check each column's data type (dates as Date, amounts as Decimal Number) before loading — CSV imports default to text when a type is ambiguous, and a text amount cannot be summed.</w:t>
+      </w:r>
+    </w:p>
+    <w:p>
+      <w:pPr>
+        <w:ind w:left="360" w:hanging="360"/>
+      </w:pPr>
+      <w:r>
+        <w:rPr>
+          <w:b/>
+          <w:color w:val="1F6FEB"/>
+        </w:rPr>
+        <w:t xml:space="preserve">3. </w:t>
+      </w:r>
+      <w:r>
+        <w:t>Add a computed column Outstanding = Amount − [Amount Paid] on invoices, then build the same three visuals as the Excel walkthrough.</w:t>
+      </w:r>
+    </w:p>
+    <w:p>
+      <w:pPr>
+        <w:ind w:left="360" w:hanging="360"/>
+      </w:pPr>
+      <w:r>
+        <w:rPr>
+          <w:b/>
+          <w:color w:val="1F6FEB"/>
+        </w:rPr>
+        <w:t xml:space="preserve">4. </w:t>
+      </w:r>
+      <w:r>
+        <w:t>Cross-check one number between the two routes: total outstanding receivables from your CSV-based dashboard must equal the workbook's Outstanding cell.</w:t>
+      </w:r>
+    </w:p>
+    <w:p>
+      <w:r>
+        <w:rPr>
+          <w:b/>
+          <w:color w:val="1F6FEB"/>
+          <w:sz w:val="22"/>
+        </w:rPr>
+        <w:t>Check your work</w:t>
+      </w:r>
+    </w:p>
+    <w:p>
+      <w:r>
+        <w:t>Power BI displays the Xero dashboard for your organisation and you can read off cash-flow, receivables and profitability insights that support budget analysis.</w:t>
+      </w:r>
+    </w:p>
+    <w:p>
+      <w:r>
+        <w:rPr>
+          <w:b/>
+          <w:color w:val="1F6FEB"/>
+        </w:rPr>
+        <w:t xml:space="preserve">Note: </w:t>
+      </w:r>
+      <w:r>
+        <w:rPr>
+          <w:sz w:val="20"/>
+        </w:rPr>
+        <w:t>A printable copy of this activity — with its workflow diagram and data files — is in the activities/activity08/ folder of the course repository.</w:t>
+      </w:r>
+    </w:p>
+    <w:p/>
+    <w:p>
+      <w:pPr>
+        <w:pStyle w:val="Heading1"/>
+      </w:pPr>
+      <w:r>
+        <w:t>Topic 06 — Budget Approval</w:t>
+      </w:r>
+    </w:p>
+    <w:p>
+      <w:r>
+        <w:t>Budget approval process · Stakeholder precautions  (A6, K10)</w:t>
+      </w:r>
+    </w:p>
+    <w:p>
+      <w:r>
+        <w:rPr>
+          <w:b/>
+          <w:color w:val="1F6FEB"/>
+          <w:sz w:val="22"/>
+        </w:rPr>
         <w:t>Key concepts</w:t>
       </w:r>
     </w:p>
@@ -3628,7 +5362,7 @@
         <w:pStyle w:val="Heading2"/>
       </w:pPr>
       <w:r>
-        <w:t>Lab 9 — Knowledge Check Quiz — Budget Approval</w:t>
+        <w:t>Activity 9 — Knowledge Check Quiz — Budget Approval</w:t>
       </w:r>
     </w:p>
     <w:p>
@@ -3669,7 +5403,7 @@
               <a:graphicData uri="http://schemas.openxmlformats.org/drawingml/2006/picture">
                 <pic:pic>
                   <pic:nvPicPr>
-                    <pic:cNvPr id="0" name="lab-09-workflow.png"/>
+                    <pic:cNvPr id="0" name="activity-09-workflow.png"/>
                     <pic:cNvPicPr/>
                   </pic:nvPicPr>
                   <pic:blipFill>
@@ -3699,7 +5433,7 @@
           <w:color w:val="555B66"/>
           <w:sz w:val="18"/>
         </w:rPr>
-        <w:t>Lab 9 workflow — Knowledge Check Quiz — Budget Approval</w:t>
+        <w:t>Activity 9 workflow — Knowledge Check Quiz — Budget Approval</w:t>
       </w:r>
     </w:p>
     <w:p>
@@ -3779,41 +5513,23 @@
           <w:color w:val="1F6FEB"/>
           <w:sz w:val="22"/>
         </w:rPr>
-        <w:t>Check your work</w:t>
-      </w:r>
-    </w:p>
-    <w:p>
-      <w:r>
-        <w:t>You submitted the quiz and can walk through the approval pack a budget manager presents — and the common issues that stall approval.</w:t>
-      </w:r>
-    </w:p>
-    <w:p>
-      <w:r>
-        <w:rPr>
-          <w:b/>
-          <w:color w:val="1F6FEB"/>
-        </w:rPr>
-        <w:t xml:space="preserve">Note: </w:t>
-      </w:r>
-      <w:r>
-        <w:rPr>
-          <w:sz w:val="20"/>
-        </w:rPr>
-        <w:t>A printable copy of this activity is in labs/lab-09-*.md in the course repository.</w:t>
-      </w:r>
-    </w:p>
-    <w:p/>
-    <w:p>
-      <w:pPr>
-        <w:pStyle w:val="Heading1"/>
-      </w:pPr>
-      <w:r>
-        <w:t>Topic 07 — Financial Compliance</w:t>
-      </w:r>
-    </w:p>
-    <w:p>
-      <w:r>
-        <w:t>Singapore taxation policies · Financial control and compliance  (A7, K6)</w:t>
+        <w:t>Data files for this activity (activities/activity09/)</w:t>
+      </w:r>
+    </w:p>
+    <w:p>
+      <w:pPr>
+        <w:pStyle w:val="ListBullet"/>
+      </w:pPr>
+      <w:r>
+        <w:t>activity-09-approval-pack.xlsx — Six departmental FY2027 budget submissions with growth-% formulas and an HQ growth-cap check.</w:t>
+      </w:r>
+    </w:p>
+    <w:p>
+      <w:pPr>
+        <w:pStyle w:val="ListBullet"/>
+      </w:pPr>
+      <w:r>
+        <w:t>activity-09-approval-pack.csv — The submissions as plain data.</w:t>
       </w:r>
     </w:p>
     <w:p>
@@ -3823,6 +5539,190 @@
           <w:color w:val="1F6FEB"/>
           <w:sz w:val="22"/>
         </w:rPr>
+        <w:t>Analyzing the Excel workbook — step by step</w:t>
+      </w:r>
+    </w:p>
+    <w:p>
+      <w:pPr>
+        <w:ind w:left="360" w:hanging="360"/>
+      </w:pPr>
+      <w:r>
+        <w:rPr>
+          <w:b/>
+          <w:color w:val="1F6FEB"/>
+        </w:rPr>
+        <w:t xml:space="preserve">1. </w:t>
+      </w:r>
+      <w:r>
+        <w:t>Open activities/activity09/activity-09-approval-pack.xlsx before the quiz — it walks the approval process with real numbers.</w:t>
+      </w:r>
+    </w:p>
+    <w:p>
+      <w:pPr>
+        <w:ind w:left="360" w:hanging="360"/>
+      </w:pPr>
+      <w:r>
+        <w:rPr>
+          <w:b/>
+          <w:color w:val="1F6FEB"/>
+        </w:rPr>
+        <w:t xml:space="preserve">2. </w:t>
+      </w:r>
+      <w:r>
+        <w:t>Each department row shows FY2026 Actual, FY2027 Requested and a Growth % formula. The yellow cell holds the HQ cap: the total ask may grow at most 8% over prior year.</w:t>
+      </w:r>
+    </w:p>
+    <w:p>
+      <w:pPr>
+        <w:ind w:left="360" w:hanging="360"/>
+      </w:pPr>
+      <w:r>
+        <w:rPr>
+          <w:b/>
+          <w:color w:val="1F6FEB"/>
+        </w:rPr>
+        <w:t xml:space="preserve">3. </w:t>
+      </w:r>
+      <w:r>
+        <w:t>Read the bottom check: total requested vs total actual → the 'Within HQ cap?' cell. The total ask (1,308,000 vs 1,124,000 ≈ +16%) exceeds the cap, so the committee must trim — exactly the 'numbers are opened up and re-sold' stage from the slides.</w:t>
+      </w:r>
+    </w:p>
+    <w:p>
+      <w:pPr>
+        <w:ind w:left="360" w:hanging="360"/>
+      </w:pPr>
+      <w:r>
+        <w:rPr>
+          <w:b/>
+          <w:color w:val="1F6FEB"/>
+        </w:rPr>
+        <w:t xml:space="preserve">4. </w:t>
+      </w:r>
+      <w:r>
+        <w:t>Play the budgeting-committee role: decide where to trim to bring the total within 8%, using each department's justification column (protect statutory HR increments; challenge the largest discretionary asks like Marketing +31% and IT +43%).</w:t>
+      </w:r>
+    </w:p>
+    <w:p>
+      <w:pPr>
+        <w:ind w:left="360" w:hanging="360"/>
+      </w:pPr>
+      <w:r>
+        <w:rPr>
+          <w:b/>
+          <w:color w:val="1F6FEB"/>
+        </w:rPr>
+        <w:t xml:space="preserve">5. </w:t>
+      </w:r>
+      <w:r>
+        <w:t>For your trimmed plan, state how you would present it for approval: past-year review, goals, forecast, plan details, realistic costs — the five-part approval pack.</w:t>
+      </w:r>
+    </w:p>
+    <w:p>
+      <w:pPr>
+        <w:ind w:left="360" w:hanging="360"/>
+      </w:pPr>
+      <w:r>
+        <w:rPr>
+          <w:b/>
+          <w:color w:val="1F6FEB"/>
+        </w:rPr>
+        <w:t xml:space="preserve">6. </w:t>
+      </w:r>
+      <w:r>
+        <w:t>Then take the Google Form quiz on budget approval.</w:t>
+      </w:r>
+    </w:p>
+    <w:p>
+      <w:r>
+        <w:rPr>
+          <w:b/>
+          <w:color w:val="1F6FEB"/>
+          <w:sz w:val="22"/>
+        </w:rPr>
+        <w:t>Analyzing the CSV data — step by step</w:t>
+      </w:r>
+    </w:p>
+    <w:p>
+      <w:pPr>
+        <w:ind w:left="360" w:hanging="360"/>
+      </w:pPr>
+      <w:r>
+        <w:rPr>
+          <w:b/>
+          <w:color w:val="1F6FEB"/>
+        </w:rPr>
+        <w:t xml:space="preserve">1. </w:t>
+      </w:r>
+      <w:r>
+        <w:t>Import activities/activity09/activity-09-approval-pack.csv into a spreadsheet and rebuild the pack: add the Growth % column, the totals row and the cap check formula yourself.</w:t>
+      </w:r>
+    </w:p>
+    <w:p>
+      <w:pPr>
+        <w:ind w:left="360" w:hanging="360"/>
+      </w:pPr>
+      <w:r>
+        <w:rPr>
+          <w:b/>
+          <w:color w:val="1F6FEB"/>
+        </w:rPr>
+        <w:t xml:space="preserve">2. </w:t>
+      </w:r>
+      <w:r>
+        <w:t>Sort by your Growth % column descending to produce the committee's challenge list — the order in which requests get questioned.</w:t>
+      </w:r>
+    </w:p>
+    <w:p>
+      <w:r>
+        <w:rPr>
+          <w:b/>
+          <w:color w:val="1F6FEB"/>
+          <w:sz w:val="22"/>
+        </w:rPr>
+        <w:t>Check your work</w:t>
+      </w:r>
+    </w:p>
+    <w:p>
+      <w:r>
+        <w:t>You submitted the quiz and can walk through the approval pack a budget manager presents — and the common issues that stall approval.</w:t>
+      </w:r>
+    </w:p>
+    <w:p>
+      <w:r>
+        <w:rPr>
+          <w:b/>
+          <w:color w:val="1F6FEB"/>
+        </w:rPr>
+        <w:t xml:space="preserve">Note: </w:t>
+      </w:r>
+      <w:r>
+        <w:rPr>
+          <w:sz w:val="20"/>
+        </w:rPr>
+        <w:t>A printable copy of this activity — with its workflow diagram and data files — is in the activities/activity09/ folder of the course repository.</w:t>
+      </w:r>
+    </w:p>
+    <w:p/>
+    <w:p>
+      <w:pPr>
+        <w:pStyle w:val="Heading1"/>
+      </w:pPr>
+      <w:r>
+        <w:t>Topic 07 — Financial Compliance</w:t>
+      </w:r>
+    </w:p>
+    <w:p>
+      <w:r>
+        <w:t>Singapore taxation policies · Financial control and compliance  (A7, K6)</w:t>
+      </w:r>
+    </w:p>
+    <w:p>
+      <w:r>
+        <w:rPr>
+          <w:b/>
+          <w:color w:val="1F6FEB"/>
+          <w:sz w:val="22"/>
+        </w:rPr>
         <w:t>Key concepts</w:t>
       </w:r>
     </w:p>
@@ -3879,7 +5779,7 @@
         <w:pStyle w:val="Heading2"/>
       </w:pPr>
       <w:r>
-        <w:t>Lab 10 — Determining the Year of Assessment</w:t>
+        <w:t>Activity 10 — Determining the Year of Assessment</w:t>
       </w:r>
     </w:p>
     <w:p>
@@ -3920,7 +5820,7 @@
               <a:graphicData uri="http://schemas.openxmlformats.org/drawingml/2006/picture">
                 <pic:pic>
                   <pic:nvPicPr>
-                    <pic:cNvPr id="0" name="lab-10-workflow.png"/>
+                    <pic:cNvPr id="0" name="activity-10-workflow.png"/>
                     <pic:cNvPicPr/>
                   </pic:nvPicPr>
                   <pic:blipFill>
@@ -3950,7 +5850,7 @@
           <w:color w:val="555B66"/>
           <w:sz w:val="18"/>
         </w:rPr>
-        <w:t>Lab 10 workflow — Determining the Year of Assessment</w:t>
+        <w:t>Activity 10 workflow — Determining the Year of Assessment</w:t>
       </w:r>
     </w:p>
     <w:p>
@@ -4045,6 +5945,157 @@
           <w:color w:val="1F6FEB"/>
           <w:sz w:val="22"/>
         </w:rPr>
+        <w:t>Data files for this activity (activities/activity10/)</w:t>
+      </w:r>
+    </w:p>
+    <w:p>
+      <w:pPr>
+        <w:pStyle w:val="ListBullet"/>
+      </w:pPr>
+      <w:r>
+        <w:t>activity-10-ya-worksheet.xlsx — Five financial years with an empty (yellow) Year of Assessment column.</w:t>
+      </w:r>
+    </w:p>
+    <w:p>
+      <w:pPr>
+        <w:pStyle w:val="ListBullet"/>
+      </w:pPr>
+      <w:r>
+        <w:t>activity-10-ya-worksheet.csv — The same worksheet as plain data.</w:t>
+      </w:r>
+    </w:p>
+    <w:p>
+      <w:r>
+        <w:rPr>
+          <w:b/>
+          <w:color w:val="1F6FEB"/>
+          <w:sz w:val="22"/>
+        </w:rPr>
+        <w:t>Analyzing the Excel workbook — step by step</w:t>
+      </w:r>
+    </w:p>
+    <w:p>
+      <w:pPr>
+        <w:ind w:left="360" w:hanging="360"/>
+      </w:pPr>
+      <w:r>
+        <w:rPr>
+          <w:b/>
+          <w:color w:val="1F6FEB"/>
+        </w:rPr>
+        <w:t xml:space="preserve">1. </w:t>
+      </w:r>
+      <w:r>
+        <w:t>Open activities/activity10/activity-10-ya-worksheet.xlsx — five financial years, including the three from the slides plus two current ones.</w:t>
+      </w:r>
+    </w:p>
+    <w:p>
+      <w:pPr>
+        <w:ind w:left="360" w:hanging="360"/>
+      </w:pPr>
+      <w:r>
+        <w:rPr>
+          <w:b/>
+          <w:color w:val="1F6FEB"/>
+        </w:rPr>
+        <w:t xml:space="preserve">2. </w:t>
+      </w:r>
+      <w:r>
+        <w:t>Recall the rule: income earned in a financial year is assessed in the YA that follows the financial year END.</w:t>
+      </w:r>
+    </w:p>
+    <w:p>
+      <w:pPr>
+        <w:ind w:left="360" w:hanging="360"/>
+      </w:pPr>
+      <w:r>
+        <w:rPr>
+          <w:b/>
+          <w:color w:val="1F6FEB"/>
+        </w:rPr>
+        <w:t xml:space="preserve">3. </w:t>
+      </w:r>
+      <w:r>
+        <w:t>Fill the yellow YA column for each row: a FY ending 31 Dec 2020 → YA 2021; ending 31 Mar 2020 → YA 2021; ending 30 Jun 2020 → YA 2021; ending 31 Dec 2025 → YA 2026; ending 30 Sep 2025 → YA 2026.</w:t>
+      </w:r>
+    </w:p>
+    <w:p>
+      <w:pPr>
+        <w:ind w:left="360" w:hanging="360"/>
+      </w:pPr>
+      <w:r>
+        <w:rPr>
+          <w:b/>
+          <w:color w:val="1F6FEB"/>
+        </w:rPr>
+        <w:t xml:space="preserve">4. </w:t>
+      </w:r>
+      <w:r>
+        <w:t>For the first row (1 Jan 2019 – 31 Dec 2020, a 24-month first period), note that IRAS attributes the income across two YAs in practice — state the YA for the year end and flag the long-first-period point for discussion.</w:t>
+      </w:r>
+    </w:p>
+    <w:p>
+      <w:pPr>
+        <w:ind w:left="360" w:hanging="360"/>
+      </w:pPr>
+      <w:r>
+        <w:rPr>
+          <w:b/>
+          <w:color w:val="1F6FEB"/>
+        </w:rPr>
+        <w:t xml:space="preserve">5. </w:t>
+      </w:r>
+      <w:r>
+        <w:t>Compare answers with the class and resolve differences against the IRAS definition.</w:t>
+      </w:r>
+    </w:p>
+    <w:p>
+      <w:r>
+        <w:rPr>
+          <w:b/>
+          <w:color w:val="1F6FEB"/>
+          <w:sz w:val="22"/>
+        </w:rPr>
+        <w:t>Analyzing the CSV data — step by step</w:t>
+      </w:r>
+    </w:p>
+    <w:p>
+      <w:pPr>
+        <w:ind w:left="360" w:hanging="360"/>
+      </w:pPr>
+      <w:r>
+        <w:rPr>
+          <w:b/>
+          <w:color w:val="1F6FEB"/>
+        </w:rPr>
+        <w:t xml:space="preserve">1. </w:t>
+      </w:r>
+      <w:r>
+        <w:t>Import activities/activity10/activity-10-ya-worksheet.csv, fill the YA column, and save your completed copy as CSV — submit or compare this file in class.</w:t>
+      </w:r>
+    </w:p>
+    <w:p>
+      <w:pPr>
+        <w:ind w:left="360" w:hanging="360"/>
+      </w:pPr>
+      <w:r>
+        <w:rPr>
+          <w:b/>
+          <w:color w:val="1F6FEB"/>
+        </w:rPr>
+        <w:t xml:space="preserve">2. </w:t>
+      </w:r>
+      <w:r>
+        <w:t>Bonus: derive YA with a formula instead of typing — extract the FY-end year with RIGHT(B2,4) and add 1.</w:t>
+      </w:r>
+    </w:p>
+    <w:p>
+      <w:r>
+        <w:rPr>
+          <w:b/>
+          <w:color w:val="1F6FEB"/>
+          <w:sz w:val="22"/>
+        </w:rPr>
         <w:t>Check your work</w:t>
       </w:r>
     </w:p>
@@ -4065,7 +6116,7 @@
         <w:rPr>
           <w:sz w:val="20"/>
         </w:rPr>
-        <w:t>A printable copy of this activity is in labs/lab-10-*.md in the course repository.</w:t>
+        <w:t>A printable copy of this activity — with its workflow diagram and data files — is in the activities/activity10/ folder of the course repository.</w:t>
       </w:r>
     </w:p>
     <w:p/>
@@ -4074,7 +6125,7 @@
         <w:pStyle w:val="Heading2"/>
       </w:pPr>
       <w:r>
-        <w:t>Lab 11 — ECI and Corporate Tax Filing Deadlines</w:t>
+        <w:t>Activity 11 — ECI and Corporate Tax Filing Deadlines</w:t>
       </w:r>
     </w:p>
     <w:p>
@@ -4115,7 +6166,7 @@
               <a:graphicData uri="http://schemas.openxmlformats.org/drawingml/2006/picture">
                 <pic:pic>
                   <pic:nvPicPr>
-                    <pic:cNvPr id="0" name="lab-11-workflow.png"/>
+                    <pic:cNvPr id="0" name="activity-11-workflow.png"/>
                     <pic:cNvPicPr/>
                   </pic:nvPicPr>
                   <pic:blipFill>
@@ -4145,7 +6196,7 @@
           <w:color w:val="555B66"/>
           <w:sz w:val="18"/>
         </w:rPr>
-        <w:t>Lab 11 workflow — ECI and Corporate Tax Filing Deadlines</w:t>
+        <w:t>Activity 11 workflow — ECI and Corporate Tax Filing Deadlines</w:t>
       </w:r>
     </w:p>
     <w:p>
@@ -4240,6 +6291,157 @@
           <w:color w:val="1F6FEB"/>
           <w:sz w:val="22"/>
         </w:rPr>
+        <w:t>Data files for this activity (activities/activity11/)</w:t>
+      </w:r>
+    </w:p>
+    <w:p>
+      <w:pPr>
+        <w:pStyle w:val="ListBullet"/>
+      </w:pPr>
+      <w:r>
+        <w:t>activity-11-filing-deadlines.xlsx — The same five financial years with empty ECI-deadline and corporate-tax e-Filing deadline columns.</w:t>
+      </w:r>
+    </w:p>
+    <w:p>
+      <w:pPr>
+        <w:pStyle w:val="ListBullet"/>
+      </w:pPr>
+      <w:r>
+        <w:t>activity-11-filing-deadlines.csv — The same worksheet as plain data.</w:t>
+      </w:r>
+    </w:p>
+    <w:p>
+      <w:r>
+        <w:rPr>
+          <w:b/>
+          <w:color w:val="1F6FEB"/>
+          <w:sz w:val="22"/>
+        </w:rPr>
+        <w:t>Analyzing the Excel workbook — step by step</w:t>
+      </w:r>
+    </w:p>
+    <w:p>
+      <w:pPr>
+        <w:ind w:left="360" w:hanging="360"/>
+      </w:pPr>
+      <w:r>
+        <w:rPr>
+          <w:b/>
+          <w:color w:val="1F6FEB"/>
+        </w:rPr>
+        <w:t xml:space="preserve">1. </w:t>
+      </w:r>
+      <w:r>
+        <w:t>Open activities/activity11/activity-11-filing-deadlines.xlsx. Two rules drive everything: ECI is due within 3 months of the financial year end; corporate tax is e-Filed by 30 November (of the YA).</w:t>
+      </w:r>
+    </w:p>
+    <w:p>
+      <w:pPr>
+        <w:ind w:left="360" w:hanging="360"/>
+      </w:pPr>
+      <w:r>
+        <w:rPr>
+          <w:b/>
+          <w:color w:val="1F6FEB"/>
+        </w:rPr>
+        <w:t xml:space="preserve">2. </w:t>
+      </w:r>
+      <w:r>
+        <w:t>Fill the ECI column: FY ending 31 Dec 2020 → ECI by 31 Mar 2021; 31 Mar 2020 → 30 Jun 2020; 30 Jun 2020 → 30 Sep 2020; 31 Dec 2025 → 31 Mar 2026; 30 Sep 2025 → 31 Dec 2025.</w:t>
+      </w:r>
+    </w:p>
+    <w:p>
+      <w:pPr>
+        <w:ind w:left="360" w:hanging="360"/>
+      </w:pPr>
+      <w:r>
+        <w:rPr>
+          <w:b/>
+          <w:color w:val="1F6FEB"/>
+        </w:rPr>
+        <w:t xml:space="preserve">3. </w:t>
+      </w:r>
+      <w:r>
+        <w:t>Fill the e-Filing column: 30 November of each row's YA (from Activity 10) — e.g. YA 2021 → 30 Nov 2021.</w:t>
+      </w:r>
+    </w:p>
+    <w:p>
+      <w:pPr>
+        <w:ind w:left="360" w:hanging="360"/>
+      </w:pPr>
+      <w:r>
+        <w:rPr>
+          <w:b/>
+          <w:color w:val="1F6FEB"/>
+        </w:rPr>
+        <w:t xml:space="preserve">4. </w:t>
+      </w:r>
+      <w:r>
+        <w:t>Optional formula: compute the ECI deadline with EDATE(end_date, 3) on a real date value to see how finance teams automate the compliance calendar.</w:t>
+      </w:r>
+    </w:p>
+    <w:p>
+      <w:pPr>
+        <w:ind w:left="360" w:hanging="360"/>
+      </w:pPr>
+      <w:r>
+        <w:rPr>
+          <w:b/>
+          <w:color w:val="1F6FEB"/>
+        </w:rPr>
+        <w:t xml:space="preserve">5. </w:t>
+      </w:r>
+      <w:r>
+        <w:t>Discuss: what can IRAS do on late filing (prosecution of officers) and late payment (5% penalty + 1%/month up to 12%)?</w:t>
+      </w:r>
+    </w:p>
+    <w:p>
+      <w:r>
+        <w:rPr>
+          <w:b/>
+          <w:color w:val="1F6FEB"/>
+          <w:sz w:val="22"/>
+        </w:rPr>
+        <w:t>Analyzing the CSV data — step by step</w:t>
+      </w:r>
+    </w:p>
+    <w:p>
+      <w:pPr>
+        <w:ind w:left="360" w:hanging="360"/>
+      </w:pPr>
+      <w:r>
+        <w:rPr>
+          <w:b/>
+          <w:color w:val="1F6FEB"/>
+        </w:rPr>
+        <w:t xml:space="preserve">1. </w:t>
+      </w:r>
+      <w:r>
+        <w:t>Import activities/activity11/activity-11-filing-deadlines.csv, complete both deadline columns, and save your answers back to CSV.</w:t>
+      </w:r>
+    </w:p>
+    <w:p>
+      <w:pPr>
+        <w:ind w:left="360" w:hanging="360"/>
+      </w:pPr>
+      <w:r>
+        <w:rPr>
+          <w:b/>
+          <w:color w:val="1F6FEB"/>
+        </w:rPr>
+        <w:t xml:space="preserve">2. </w:t>
+      </w:r>
+      <w:r>
+        <w:t>Sort by ECI deadline to produce the compliance calendar in date order — the view a finance manager pins on the wall.</w:t>
+      </w:r>
+    </w:p>
+    <w:p>
+      <w:r>
+        <w:rPr>
+          <w:b/>
+          <w:color w:val="1F6FEB"/>
+          <w:sz w:val="22"/>
+        </w:rPr>
         <w:t>Check your work</w:t>
       </w:r>
     </w:p>
@@ -4260,7 +6462,7 @@
         <w:rPr>
           <w:sz w:val="20"/>
         </w:rPr>
-        <w:t>A printable copy of this activity is in labs/lab-11-*.md in the course repository.</w:t>
+        <w:t>A printable copy of this activity — with its workflow diagram and data files — is in the activities/activity11/ folder of the course repository.</w:t>
       </w:r>
     </w:p>
     <w:p/>
@@ -4269,7 +6471,7 @@
         <w:pStyle w:val="Heading2"/>
       </w:pPr>
       <w:r>
-        <w:t>Lab 12 — Start-Up Tax Computation</w:t>
+        <w:t>Activity 12 — Start-Up Tax Computation</w:t>
       </w:r>
     </w:p>
     <w:p>
@@ -4310,7 +6512,7 @@
               <a:graphicData uri="http://schemas.openxmlformats.org/drawingml/2006/picture">
                 <pic:pic>
                   <pic:nvPicPr>
-                    <pic:cNvPr id="0" name="lab-12-workflow.png"/>
+                    <pic:cNvPr id="0" name="activity-12-workflow.png"/>
                     <pic:cNvPicPr/>
                   </pic:nvPicPr>
                   <pic:blipFill>
@@ -4340,7 +6542,7 @@
           <w:color w:val="555B66"/>
           <w:sz w:val="18"/>
         </w:rPr>
-        <w:t>Lab 12 workflow — Start-Up Tax Computation</w:t>
+        <w:t>Activity 12 workflow — Start-Up Tax Computation</w:t>
       </w:r>
     </w:p>
     <w:p>
@@ -4480,6 +6682,187 @@
           <w:color w:val="1F6FEB"/>
           <w:sz w:val="22"/>
         </w:rPr>
+        <w:t>Data files for this activity (activities/activity12/)</w:t>
+      </w:r>
+    </w:p>
+    <w:p>
+      <w:pPr>
+        <w:pStyle w:val="ListBullet"/>
+      </w:pPr>
+      <w:r>
+        <w:t>activity-12-startup-tax.xlsx — Five years of profits with empty exemption / chargeable / tax columns, plus a Rates sheet holding the exemption rules.</w:t>
+      </w:r>
+    </w:p>
+    <w:p>
+      <w:pPr>
+        <w:pStyle w:val="ListBullet"/>
+      </w:pPr>
+      <w:r>
+        <w:t>activity-12-startup-tax.csv — The same computation table as plain data.</w:t>
+      </w:r>
+    </w:p>
+    <w:p>
+      <w:r>
+        <w:rPr>
+          <w:b/>
+          <w:color w:val="1F6FEB"/>
+          <w:sz w:val="22"/>
+        </w:rPr>
+        <w:t>Analyzing the Excel workbook — step by step</w:t>
+      </w:r>
+    </w:p>
+    <w:p>
+      <w:pPr>
+        <w:ind w:left="360" w:hanging="360"/>
+      </w:pPr>
+      <w:r>
+        <w:rPr>
+          <w:b/>
+          <w:color w:val="1F6FEB"/>
+        </w:rPr>
+        <w:t xml:space="preserve">1. </w:t>
+      </w:r>
+      <w:r>
+        <w:t>Open activities/activity12/activity-12-startup-tax.xlsx. The Rates sheet holds the rules: 17% flat rate; Start-Up Exemption (first 3 YAs) 75% of the first S$100,000 + 50% of the next S$100,000; from Year 4 the Partial Exemption of 75% of the first S$10,000 + 50% of the next S$190,000.</w:t>
+      </w:r>
+    </w:p>
+    <w:p>
+      <w:pPr>
+        <w:ind w:left="360" w:hanging="360"/>
+      </w:pPr>
+      <w:r>
+        <w:rPr>
+          <w:b/>
+          <w:color w:val="1F6FEB"/>
+        </w:rPr>
+        <w:t xml:space="preserve">2. </w:t>
+      </w:r>
+      <w:r>
+        <w:t>Year 1 (profits 200,000): exempt = 75%×100,000 + 50%×100,000 = 125,000; chargeable = 75,000; tax = 75,000 × 17% = 12,750. Enter these in the yellow cells — with formulas referencing the Rates sheet, not typed numbers.</w:t>
+      </w:r>
+    </w:p>
+    <w:p>
+      <w:pPr>
+        <w:ind w:left="360" w:hanging="360"/>
+      </w:pPr>
+      <w:r>
+        <w:rPr>
+          <w:b/>
+          <w:color w:val="1F6FEB"/>
+        </w:rPr>
+        <w:t xml:space="preserve">3. </w:t>
+      </w:r>
+      <w:r>
+        <w:t>Year 2 (300,000): the exemption only ever covers the first 200,000 of income, so exempt = 125,000; chargeable = 175,000; tax = 29,750.</w:t>
+      </w:r>
+    </w:p>
+    <w:p>
+      <w:pPr>
+        <w:ind w:left="360" w:hanging="360"/>
+      </w:pPr>
+      <w:r>
+        <w:rPr>
+          <w:b/>
+          <w:color w:val="1F6FEB"/>
+        </w:rPr>
+        <w:t xml:space="preserve">4. </w:t>
+      </w:r>
+      <w:r>
+        <w:t>Year 3 (400,000): exempt = 125,000; chargeable = 275,000; tax = 46,750 — the last start-up-exemption year.</w:t>
+      </w:r>
+    </w:p>
+    <w:p>
+      <w:pPr>
+        <w:ind w:left="360" w:hanging="360"/>
+      </w:pPr>
+      <w:r>
+        <w:rPr>
+          <w:b/>
+          <w:color w:val="1F6FEB"/>
+        </w:rPr>
+        <w:t xml:space="preserve">5. </w:t>
+      </w:r>
+      <w:r>
+        <w:t>Year 4 (500,000): switch to the Partial Exemption — exempt = 75%×10,000 + 50%×190,000 = 102,500; chargeable = 397,500; tax = 67,575.</w:t>
+      </w:r>
+    </w:p>
+    <w:p>
+      <w:pPr>
+        <w:ind w:left="360" w:hanging="360"/>
+      </w:pPr>
+      <w:r>
+        <w:rPr>
+          <w:b/>
+          <w:color w:val="1F6FEB"/>
+        </w:rPr>
+        <w:t xml:space="preserve">6. </w:t>
+      </w:r>
+      <w:r>
+        <w:t>Year 5 (600,000): exempt = 102,500; chargeable = 497,500; tax = 84,575.</w:t>
+      </w:r>
+    </w:p>
+    <w:p>
+      <w:pPr>
+        <w:ind w:left="360" w:hanging="360"/>
+      </w:pPr>
+      <w:r>
+        <w:rPr>
+          <w:b/>
+          <w:color w:val="1F6FEB"/>
+        </w:rPr>
+        <w:t xml:space="preserve">7. </w:t>
+      </w:r>
+      <w:r>
+        <w:t>Add a Total row (=SUM of the tax column = 241,400) and a check: effective tax rate per year = tax ÷ profits — watch it climb from 6.4% to 14.1% as the start-up relief expires.</w:t>
+      </w:r>
+    </w:p>
+    <w:p>
+      <w:r>
+        <w:rPr>
+          <w:b/>
+          <w:color w:val="1F6FEB"/>
+          <w:sz w:val="22"/>
+        </w:rPr>
+        <w:t>Analyzing the CSV data — step by step</w:t>
+      </w:r>
+    </w:p>
+    <w:p>
+      <w:pPr>
+        <w:ind w:left="360" w:hanging="360"/>
+      </w:pPr>
+      <w:r>
+        <w:rPr>
+          <w:b/>
+          <w:color w:val="1F6FEB"/>
+        </w:rPr>
+        <w:t xml:space="preserve">1. </w:t>
+      </w:r>
+      <w:r>
+        <w:t>Import activities/activity12/activity-12-startup-tax.csv, rebuild the same computation with formulas, and compare your five tax figures with the class.</w:t>
+      </w:r>
+    </w:p>
+    <w:p>
+      <w:pPr>
+        <w:ind w:left="360" w:hanging="360"/>
+      </w:pPr>
+      <w:r>
+        <w:rPr>
+          <w:b/>
+          <w:color w:val="1F6FEB"/>
+        </w:rPr>
+        <w:t xml:space="preserve">2. </w:t>
+      </w:r>
+      <w:r>
+        <w:t>Save your completed computation as CSV — a values-only copy is what you would attach to a tax working-paper file.</w:t>
+      </w:r>
+    </w:p>
+    <w:p>
+      <w:r>
+        <w:rPr>
+          <w:b/>
+          <w:color w:val="1F6FEB"/>
+          <w:sz w:val="22"/>
+        </w:rPr>
         <w:t>Check your work</w:t>
       </w:r>
     </w:p>
@@ -4500,7 +6883,7 @@
         <w:rPr>
           <w:sz w:val="20"/>
         </w:rPr>
-        <w:t>A printable copy of this activity is in labs/lab-12-*.md in the course repository.</w:t>
+        <w:t>A printable copy of this activity — with its workflow diagram and data files — is in the activities/activity12/ folder of the course repository.</w:t>
       </w:r>
     </w:p>
     <w:p/>

</xml_diff>